<commit_message>
Add coupled digital vehicle dynamics
</commit_message>
<xml_diff>
--- a/docs/ATEP_Volume_II_Digital_Vehicle_Engineering_Workbook.docx
+++ b/docs/ATEP_Volume_II_Digital_Vehicle_Engineering_Workbook.docx
@@ -143,7 +143,7 @@
                 <w:color w:val="0B2545"/>
                 <w:sz w:val="19"/>
               </w:rPr>
-              <w:t>0.3.0</w:t>
+              <w:t>0.4.0</w:t>
             </w:r>
           </w:p>
         </w:tc>
@@ -265,7 +265,7 @@
                 <w:color w:val="111827"/>
                 <w:sz w:val="19"/>
               </w:rPr>
-              <w:t>Living document - Increments II-1 through II-3 implemented</w:t>
+              <w:t>Living document - Increments II-1 through II-4 implemented</w:t>
             </w:r>
           </w:p>
         </w:tc>
@@ -1616,6 +1616,123 @@
           </w:p>
         </w:tc>
       </w:tr>
+      <w:tr>
+        <w:trPr>
+          <w:cantSplit/>
+        </w:trPr>
+        <w:tc>
+          <w:tcPr>
+            <w:tcW w:type="dxa" w:w="1150"/>
+            <w:tcMar>
+              <w:top w:w="80" w:type="dxa"/>
+              <w:start w:w="120" w:type="dxa"/>
+              <w:bottom w:w="80" w:type="dxa"/>
+              <w:end w:w="120" w:type="dxa"/>
+            </w:tcMar>
+            <w:vAlign w:val="center"/>
+            <w:shd w:fill="FFFFFF"/>
+          </w:tcPr>
+          <w:p>
+            <w:pPr>
+              <w:spacing w:before="0" w:after="40" w:line="252" w:lineRule="auto"/>
+              <w:jc w:val="center"/>
+            </w:pPr>
+            <w:r>
+              <w:rPr>
+                <w:rFonts w:ascii="Calibri" w:hAnsi="Calibri"/>
+                <w:b w:val="0"/>
+                <w:color w:val="111827"/>
+                <w:sz w:val="16"/>
+              </w:rPr>
+              <w:t>0.4.0</w:t>
+            </w:r>
+          </w:p>
+        </w:tc>
+        <w:tc>
+          <w:tcPr>
+            <w:tcW w:type="dxa" w:w="1400"/>
+            <w:tcMar>
+              <w:top w:w="80" w:type="dxa"/>
+              <w:start w:w="120" w:type="dxa"/>
+              <w:bottom w:w="80" w:type="dxa"/>
+              <w:end w:w="120" w:type="dxa"/>
+            </w:tcMar>
+            <w:vAlign w:val="center"/>
+            <w:shd w:fill="FFFFFF"/>
+          </w:tcPr>
+          <w:p>
+            <w:pPr>
+              <w:spacing w:before="0" w:after="40" w:line="252" w:lineRule="auto"/>
+              <w:jc w:val="left"/>
+            </w:pPr>
+            <w:r>
+              <w:rPr>
+                <w:rFonts w:ascii="Calibri" w:hAnsi="Calibri"/>
+                <w:b w:val="0"/>
+                <w:color w:val="111827"/>
+                <w:sz w:val="16"/>
+              </w:rPr>
+              <w:t>12 August 2026</w:t>
+            </w:r>
+          </w:p>
+        </w:tc>
+        <w:tc>
+          <w:tcPr>
+            <w:tcW w:type="dxa" w:w="3450"/>
+            <w:tcMar>
+              <w:top w:w="80" w:type="dxa"/>
+              <w:start w:w="120" w:type="dxa"/>
+              <w:bottom w:w="80" w:type="dxa"/>
+              <w:end w:w="120" w:type="dxa"/>
+            </w:tcMar>
+            <w:vAlign w:val="center"/>
+            <w:shd w:fill="FFFFFF"/>
+          </w:tcPr>
+          <w:p>
+            <w:pPr>
+              <w:spacing w:before="0" w:after="40" w:line="252" w:lineRule="auto"/>
+              <w:jc w:val="left"/>
+            </w:pPr>
+            <w:r>
+              <w:rPr>
+                <w:rFonts w:ascii="Calibri" w:hAnsi="Calibri"/>
+                <w:b w:val="0"/>
+                <w:color w:val="111827"/>
+                <w:sz w:val="16"/>
+              </w:rPr>
+              <w:t>II-4: coupled road and ambient inputs with battery energy, thermal response, powertrain, regenerative braking, steering, suspension, and lighting</w:t>
+            </w:r>
+          </w:p>
+        </w:tc>
+        <w:tc>
+          <w:tcPr>
+            <w:tcW w:type="dxa" w:w="3360"/>
+            <w:tcMar>
+              <w:top w:w="80" w:type="dxa"/>
+              <w:start w:w="120" w:type="dxa"/>
+              <w:bottom w:w="80" w:type="dxa"/>
+              <w:end w:w="120" w:type="dxa"/>
+            </w:tcMar>
+            <w:vAlign w:val="center"/>
+            <w:shd w:fill="FFFFFF"/>
+          </w:tcPr>
+          <w:p>
+            <w:pPr>
+              <w:spacing w:before="0" w:after="40" w:line="252" w:lineRule="auto"/>
+              <w:jc w:val="left"/>
+            </w:pPr>
+            <w:r>
+              <w:rPr>
+                <w:rFonts w:ascii="Calibri" w:hAnsi="Calibri"/>
+                <w:b w:val="0"/>
+                <w:color w:val="111827"/>
+                <w:sz w:val="16"/>
+              </w:rPr>
+              <w:t>Implemented and verified by scenario, conservation, bounds, migration, and hosted integration tests</w:t>
+            </w:r>
+          </w:p>
+        </w:tc>
+      </w:tr>
     </w:tbl>
     <w:p>
       <w:pPr>
@@ -2783,7 +2900,7 @@
                 <w:color w:val="111827"/>
                 <w:sz w:val="17"/>
               </w:rPr>
-              <w:t>SOC, SOH, voltage, current, temperature, contactors, charging</w:t>
+              <w:t>SOC, SOH, usable energy, voltage, current, temperature, contactors, charging</w:t>
             </w:r>
           </w:p>
         </w:tc>
@@ -2811,7 +2928,7 @@
                 <w:color w:val="111827"/>
                 <w:sz w:val="17"/>
               </w:rPr>
-              <w:t>SOC/SOH 0-100%; charging requires stationary park state</w:t>
+              <w:t>SOC/SOH 0-100%; energy and temperature bounded; charging requires stationary park state</w:t>
             </w:r>
           </w:p>
         </w:tc>
@@ -3168,6 +3285,95 @@
                 <w:sz w:val="17"/>
               </w:rPr>
               <w:t>Brake lamps follow modeled brake input during steps</w:t>
+            </w:r>
+          </w:p>
+        </w:tc>
+      </w:tr>
+      <w:tr>
+        <w:trPr>
+          <w:cantSplit/>
+        </w:trPr>
+        <w:tc>
+          <w:tcPr>
+            <w:tcW w:type="dxa" w:w="1650"/>
+            <w:tcMar>
+              <w:top w:w="80" w:type="dxa"/>
+              <w:start w:w="120" w:type="dxa"/>
+              <w:bottom w:w="80" w:type="dxa"/>
+              <w:end w:w="120" w:type="dxa"/>
+            </w:tcMar>
+            <w:vAlign w:val="center"/>
+            <w:shd w:fill="FFFFFF"/>
+          </w:tcPr>
+          <w:p>
+            <w:pPr>
+              <w:spacing w:before="0" w:after="40" w:line="252" w:lineRule="auto"/>
+              <w:jc w:val="center"/>
+            </w:pPr>
+            <w:r>
+              <w:rPr>
+                <w:rFonts w:ascii="Calibri" w:hAnsi="Calibri"/>
+                <w:b w:val="0"/>
+                <w:color w:val="111827"/>
+                <w:sz w:val="17"/>
+              </w:rPr>
+              <w:t>Suspension</w:t>
+            </w:r>
+          </w:p>
+        </w:tc>
+        <w:tc>
+          <w:tcPr>
+            <w:tcW w:type="dxa" w:w="4450"/>
+            <w:tcMar>
+              <w:top w:w="80" w:type="dxa"/>
+              <w:start w:w="120" w:type="dxa"/>
+              <w:bottom w:w="80" w:type="dxa"/>
+              <w:end w:w="120" w:type="dxa"/>
+            </w:tcMar>
+            <w:vAlign w:val="center"/>
+            <w:shd w:fill="FFFFFF"/>
+          </w:tcPr>
+          <w:p>
+            <w:pPr>
+              <w:spacing w:before="0" w:after="40" w:line="252" w:lineRule="auto"/>
+              <w:jc w:val="left"/>
+            </w:pPr>
+            <w:r>
+              <w:rPr>
+                <w:rFonts w:ascii="Calibri" w:hAnsi="Calibri"/>
+                <w:b w:val="0"/>
+                <w:color w:val="111827"/>
+                <w:sz w:val="17"/>
+              </w:rPr>
+              <w:t>front/rear travel and lateral acceleration</w:t>
+            </w:r>
+          </w:p>
+        </w:tc>
+        <w:tc>
+          <w:tcPr>
+            <w:tcW w:type="dxa" w:w="3260"/>
+            <w:tcMar>
+              <w:top w:w="80" w:type="dxa"/>
+              <w:start w:w="120" w:type="dxa"/>
+              <w:bottom w:w="80" w:type="dxa"/>
+              <w:end w:w="120" w:type="dxa"/>
+            </w:tcMar>
+            <w:vAlign w:val="center"/>
+            <w:shd w:fill="FFFFFF"/>
+          </w:tcPr>
+          <w:p>
+            <w:pPr>
+              <w:spacing w:before="0" w:after="40" w:line="252" w:lineRule="auto"/>
+              <w:jc w:val="left"/>
+            </w:pPr>
+            <w:r>
+              <w:rPr>
+                <w:rFonts w:ascii="Calibri" w:hAnsi="Calibri"/>
+                <w:b w:val="0"/>
+                <w:color w:val="111827"/>
+                <w:sz w:val="17"/>
+              </w:rPr>
+              <w:t>Travel bounded to ±120 mm and lateral acceleration to ±20 m/s²</w:t>
             </w:r>
           </w:p>
         </w:tc>
@@ -3791,6 +3997,52 @@
           <w:sz w:val="22"/>
         </w:rPr>
         <w:t xml:space="preserve"> adds a configured delta. Faults affect observed readings without silently replacing physical state.</w:t>
+      </w:r>
+    </w:p>
+    <w:p>
+      <w:pPr>
+        <w:pStyle w:val="Heading2"/>
+        <w:keepNext/>
+        <w:keepLines/>
+      </w:pPr>
+      <w:r>
+        <w:t>6.4 Coupled Dynamics</w:t>
+      </w:r>
+    </w:p>
+    <w:p>
+      <w:r>
+        <w:rPr>
+          <w:rFonts w:ascii="Calibri" w:hAnsi="Calibri"/>
+          <w:color w:val="111827"/>
+          <w:sz w:val="22"/>
+        </w:rPr>
+        <w:t xml:space="preserve">The II-4 model adds road grade, road roughness, ambient temperature, and ambient light to each deterministic step. It publishes energy used, regenerative energy recovered, and net energy in Wh; the three values satisfy </w:t>
+      </w:r>
+      <w:r>
+        <w:rPr>
+          <w:rFonts w:ascii="Consolas" w:hAnsi="Consolas"/>
+          <w:color w:val="1F4D78"/>
+          <w:sz w:val="19"/>
+        </w:rPr>
+        <w:t>used - recovered = net</w:t>
+      </w:r>
+      <w:r>
+        <w:rPr>
+          <w:rFonts w:ascii="Calibri" w:hAnsi="Calibri"/>
+          <w:color w:val="111827"/>
+          <w:sz w:val="22"/>
+        </w:rPr>
+        <w:t xml:space="preserve"> at the published precision. Net energy reduces usable battery energy and SOC, while regenerative recovery remains bounded.</w:t>
+      </w:r>
+    </w:p>
+    <w:p>
+      <w:r>
+        <w:rPr>
+          <w:rFonts w:ascii="Calibri" w:hAnsi="Calibri"/>
+          <w:color w:val="111827"/>
+          <w:sz w:val="22"/>
+        </w:rPr>
+        <w:t>Torque includes grade demand and braking regeneration. Battery temperature combines load heating and ambient cooling. Steering and speed produce bounded lateral acceleration; roughness, braking, and acceleration produce front/rear suspension travel. Brake lamps and low-beam behavior follow brake and ambient-light inputs.</w:t>
       </w:r>
     </w:p>
     <w:p>
@@ -5404,6 +5656,273 @@
           </w:p>
         </w:tc>
       </w:tr>
+      <w:tr>
+        <w:trPr>
+          <w:cantSplit/>
+        </w:trPr>
+        <w:tc>
+          <w:tcPr>
+            <w:tcW w:type="dxa" w:w="1650"/>
+            <w:tcMar>
+              <w:top w:w="80" w:type="dxa"/>
+              <w:start w:w="120" w:type="dxa"/>
+              <w:bottom w:w="80" w:type="dxa"/>
+              <w:end w:w="120" w:type="dxa"/>
+            </w:tcMar>
+            <w:vAlign w:val="center"/>
+            <w:shd w:fill="FFFFFF"/>
+          </w:tcPr>
+          <w:p>
+            <w:pPr>
+              <w:spacing w:before="0" w:after="40" w:line="252" w:lineRule="auto"/>
+              <w:jc w:val="center"/>
+            </w:pPr>
+            <w:r>
+              <w:rPr>
+                <w:rFonts w:ascii="Calibri" w:hAnsi="Calibri"/>
+                <w:b w:val="0"/>
+                <w:color w:val="111827"/>
+                <w:sz w:val="17"/>
+              </w:rPr>
+              <w:t>DV-F-016</w:t>
+            </w:r>
+          </w:p>
+        </w:tc>
+        <w:tc>
+          <w:tcPr>
+            <w:tcW w:type="dxa" w:w="4450"/>
+            <w:tcMar>
+              <w:top w:w="80" w:type="dxa"/>
+              <w:start w:w="120" w:type="dxa"/>
+              <w:bottom w:w="80" w:type="dxa"/>
+              <w:end w:w="120" w:type="dxa"/>
+            </w:tcMar>
+            <w:vAlign w:val="center"/>
+            <w:shd w:fill="FFFFFF"/>
+          </w:tcPr>
+          <w:p>
+            <w:pPr>
+              <w:spacing w:before="0" w:after="40" w:line="252" w:lineRule="auto"/>
+              <w:jc w:val="left"/>
+            </w:pPr>
+            <w:r>
+              <w:rPr>
+                <w:rFonts w:ascii="Calibri" w:hAnsi="Calibri"/>
+                <w:b w:val="0"/>
+                <w:color w:val="111827"/>
+                <w:sz w:val="17"/>
+              </w:rPr>
+              <w:t>Steps shall calculate bounded energy use, regeneration, usable energy, and SOC.</w:t>
+            </w:r>
+          </w:p>
+        </w:tc>
+        <w:tc>
+          <w:tcPr>
+            <w:tcW w:type="dxa" w:w="3260"/>
+            <w:tcMar>
+              <w:top w:w="80" w:type="dxa"/>
+              <w:start w:w="120" w:type="dxa"/>
+              <w:bottom w:w="80" w:type="dxa"/>
+              <w:end w:w="120" w:type="dxa"/>
+            </w:tcMar>
+            <w:vAlign w:val="center"/>
+            <w:shd w:fill="FFFFFF"/>
+          </w:tcPr>
+          <w:p>
+            <w:pPr>
+              <w:spacing w:before="0" w:after="40" w:line="252" w:lineRule="auto"/>
+              <w:jc w:val="left"/>
+            </w:pPr>
+            <w:r>
+              <w:rPr>
+                <w:rFonts w:ascii="Calibri" w:hAnsi="Calibri"/>
+                <w:b w:val="0"/>
+                <w:color w:val="111827"/>
+                <w:sz w:val="17"/>
+              </w:rPr>
+              <w:t>Conservation and braking tests</w:t>
+            </w:r>
+          </w:p>
+        </w:tc>
+      </w:tr>
+      <w:tr>
+        <w:trPr>
+          <w:cantSplit/>
+        </w:trPr>
+        <w:tc>
+          <w:tcPr>
+            <w:tcW w:type="dxa" w:w="1650"/>
+            <w:tcMar>
+              <w:top w:w="80" w:type="dxa"/>
+              <w:start w:w="120" w:type="dxa"/>
+              <w:bottom w:w="80" w:type="dxa"/>
+              <w:end w:w="120" w:type="dxa"/>
+            </w:tcMar>
+            <w:vAlign w:val="center"/>
+            <w:shd w:fill="FFFFFF"/>
+          </w:tcPr>
+          <w:p>
+            <w:pPr>
+              <w:spacing w:before="0" w:after="40" w:line="252" w:lineRule="auto"/>
+              <w:jc w:val="center"/>
+            </w:pPr>
+            <w:r>
+              <w:rPr>
+                <w:rFonts w:ascii="Calibri" w:hAnsi="Calibri"/>
+                <w:b w:val="0"/>
+                <w:color w:val="111827"/>
+                <w:sz w:val="17"/>
+              </w:rPr>
+              <w:t>DV-F-017</w:t>
+            </w:r>
+          </w:p>
+        </w:tc>
+        <w:tc>
+          <w:tcPr>
+            <w:tcW w:type="dxa" w:w="4450"/>
+            <w:tcMar>
+              <w:top w:w="80" w:type="dxa"/>
+              <w:start w:w="120" w:type="dxa"/>
+              <w:bottom w:w="80" w:type="dxa"/>
+              <w:end w:w="120" w:type="dxa"/>
+            </w:tcMar>
+            <w:vAlign w:val="center"/>
+            <w:shd w:fill="FFFFFF"/>
+          </w:tcPr>
+          <w:p>
+            <w:pPr>
+              <w:spacing w:before="0" w:after="40" w:line="252" w:lineRule="auto"/>
+              <w:jc w:val="left"/>
+            </w:pPr>
+            <w:r>
+              <w:rPr>
+                <w:rFonts w:ascii="Calibri" w:hAnsi="Calibri"/>
+                <w:b w:val="0"/>
+                <w:color w:val="111827"/>
+                <w:sz w:val="17"/>
+              </w:rPr>
+              <w:t>Thermal response shall combine load generation, ambient cooling, and absolute bounds.</w:t>
+            </w:r>
+          </w:p>
+        </w:tc>
+        <w:tc>
+          <w:tcPr>
+            <w:tcW w:type="dxa" w:w="3260"/>
+            <w:tcMar>
+              <w:top w:w="80" w:type="dxa"/>
+              <w:start w:w="120" w:type="dxa"/>
+              <w:bottom w:w="80" w:type="dxa"/>
+              <w:end w:w="120" w:type="dxa"/>
+            </w:tcMar>
+            <w:vAlign w:val="center"/>
+            <w:shd w:fill="FFFFFF"/>
+          </w:tcPr>
+          <w:p>
+            <w:pPr>
+              <w:spacing w:before="0" w:after="40" w:line="252" w:lineRule="auto"/>
+              <w:jc w:val="left"/>
+            </w:pPr>
+            <w:r>
+              <w:rPr>
+                <w:rFonts w:ascii="Calibri" w:hAnsi="Calibri"/>
+                <w:b w:val="0"/>
+                <w:color w:val="111827"/>
+                <w:sz w:val="17"/>
+              </w:rPr>
+              <w:t>Scenario and boundary tests</w:t>
+            </w:r>
+          </w:p>
+        </w:tc>
+      </w:tr>
+      <w:tr>
+        <w:trPr>
+          <w:cantSplit/>
+        </w:trPr>
+        <w:tc>
+          <w:tcPr>
+            <w:tcW w:type="dxa" w:w="1650"/>
+            <w:tcMar>
+              <w:top w:w="80" w:type="dxa"/>
+              <w:start w:w="120" w:type="dxa"/>
+              <w:bottom w:w="80" w:type="dxa"/>
+              <w:end w:w="120" w:type="dxa"/>
+            </w:tcMar>
+            <w:vAlign w:val="center"/>
+            <w:shd w:fill="FFFFFF"/>
+          </w:tcPr>
+          <w:p>
+            <w:pPr>
+              <w:spacing w:before="0" w:after="40" w:line="252" w:lineRule="auto"/>
+              <w:jc w:val="center"/>
+            </w:pPr>
+            <w:r>
+              <w:rPr>
+                <w:rFonts w:ascii="Calibri" w:hAnsi="Calibri"/>
+                <w:b w:val="0"/>
+                <w:color w:val="111827"/>
+                <w:sz w:val="17"/>
+              </w:rPr>
+              <w:t>DV-F-018</w:t>
+            </w:r>
+          </w:p>
+        </w:tc>
+        <w:tc>
+          <w:tcPr>
+            <w:tcW w:type="dxa" w:w="4450"/>
+            <w:tcMar>
+              <w:top w:w="80" w:type="dxa"/>
+              <w:start w:w="120" w:type="dxa"/>
+              <w:bottom w:w="80" w:type="dxa"/>
+              <w:end w:w="120" w:type="dxa"/>
+            </w:tcMar>
+            <w:vAlign w:val="center"/>
+            <w:shd w:fill="FFFFFF"/>
+          </w:tcPr>
+          <w:p>
+            <w:pPr>
+              <w:spacing w:before="0" w:after="40" w:line="252" w:lineRule="auto"/>
+              <w:jc w:val="left"/>
+            </w:pPr>
+            <w:r>
+              <w:rPr>
+                <w:rFonts w:ascii="Calibri" w:hAnsi="Calibri"/>
+                <w:b w:val="0"/>
+                <w:color w:val="111827"/>
+                <w:sz w:val="17"/>
+              </w:rPr>
+              <w:t>Road and ambient inputs shall influence powertrain, suspension, steering response, and lighting deterministically.</w:t>
+            </w:r>
+          </w:p>
+        </w:tc>
+        <w:tc>
+          <w:tcPr>
+            <w:tcW w:type="dxa" w:w="3260"/>
+            <w:tcMar>
+              <w:top w:w="80" w:type="dxa"/>
+              <w:start w:w="120" w:type="dxa"/>
+              <w:bottom w:w="80" w:type="dxa"/>
+              <w:end w:w="120" w:type="dxa"/>
+            </w:tcMar>
+            <w:vAlign w:val="center"/>
+            <w:shd w:fill="FFFFFF"/>
+          </w:tcPr>
+          <w:p>
+            <w:pPr>
+              <w:spacing w:before="0" w:after="40" w:line="252" w:lineRule="auto"/>
+              <w:jc w:val="left"/>
+            </w:pPr>
+            <w:r>
+              <w:rPr>
+                <w:rFonts w:ascii="Calibri" w:hAnsi="Calibri"/>
+                <w:b w:val="0"/>
+                <w:color w:val="111827"/>
+                <w:sz w:val="17"/>
+              </w:rPr>
+              <w:t>Coupled scenario test</w:t>
+            </w:r>
+          </w:p>
+        </w:tc>
+      </w:tr>
     </w:tbl>
     <w:p>
       <w:pPr>
@@ -6243,6 +6762,95 @@
           </w:p>
         </w:tc>
       </w:tr>
+      <w:tr>
+        <w:trPr>
+          <w:cantSplit/>
+        </w:trPr>
+        <w:tc>
+          <w:tcPr>
+            <w:tcW w:type="dxa" w:w="1650"/>
+            <w:tcMar>
+              <w:top w:w="80" w:type="dxa"/>
+              <w:start w:w="120" w:type="dxa"/>
+              <w:bottom w:w="80" w:type="dxa"/>
+              <w:end w:w="120" w:type="dxa"/>
+            </w:tcMar>
+            <w:vAlign w:val="center"/>
+            <w:shd w:fill="FFFFFF"/>
+          </w:tcPr>
+          <w:p>
+            <w:pPr>
+              <w:spacing w:before="0" w:after="40" w:line="252" w:lineRule="auto"/>
+              <w:jc w:val="center"/>
+            </w:pPr>
+            <w:r>
+              <w:rPr>
+                <w:rFonts w:ascii="Calibri" w:hAnsi="Calibri"/>
+                <w:b w:val="0"/>
+                <w:color w:val="111827"/>
+                <w:sz w:val="17"/>
+              </w:rPr>
+              <w:t>DV-NF-009</w:t>
+            </w:r>
+          </w:p>
+        </w:tc>
+        <w:tc>
+          <w:tcPr>
+            <w:tcW w:type="dxa" w:w="4450"/>
+            <w:tcMar>
+              <w:top w:w="80" w:type="dxa"/>
+              <w:start w:w="120" w:type="dxa"/>
+              <w:bottom w:w="80" w:type="dxa"/>
+              <w:end w:w="120" w:type="dxa"/>
+            </w:tcMar>
+            <w:vAlign w:val="center"/>
+            <w:shd w:fill="FFFFFF"/>
+          </w:tcPr>
+          <w:p>
+            <w:pPr>
+              <w:spacing w:before="0" w:after="40" w:line="252" w:lineRule="auto"/>
+              <w:jc w:val="left"/>
+            </w:pPr>
+            <w:r>
+              <w:rPr>
+                <w:rFonts w:ascii="Calibri" w:hAnsi="Calibri"/>
+                <w:b w:val="0"/>
+                <w:color w:val="111827"/>
+                <w:sz w:val="17"/>
+              </w:rPr>
+              <w:t>Published energy evidence shall conserve energy at contract precision.</w:t>
+            </w:r>
+          </w:p>
+        </w:tc>
+        <w:tc>
+          <w:tcPr>
+            <w:tcW w:type="dxa" w:w="3260"/>
+            <w:tcMar>
+              <w:top w:w="80" w:type="dxa"/>
+              <w:start w:w="120" w:type="dxa"/>
+              <w:bottom w:w="80" w:type="dxa"/>
+              <w:end w:w="120" w:type="dxa"/>
+            </w:tcMar>
+            <w:vAlign w:val="center"/>
+            <w:shd w:fill="FFFFFF"/>
+          </w:tcPr>
+          <w:p>
+            <w:pPr>
+              <w:spacing w:before="0" w:after="40" w:line="252" w:lineRule="auto"/>
+              <w:jc w:val="left"/>
+            </w:pPr>
+            <w:r>
+              <w:rPr>
+                <w:rFonts w:ascii="Calibri" w:hAnsi="Calibri"/>
+                <w:b w:val="0"/>
+                <w:color w:val="111827"/>
+                <w:sz w:val="17"/>
+              </w:rPr>
+              <w:t>Conservation assertions</w:t>
+            </w:r>
+          </w:p>
+        </w:tc>
+      </w:tr>
     </w:tbl>
     <w:p>
       <w:pPr>
@@ -6433,6 +7041,54 @@
           <w:sz w:val="22"/>
         </w:rPr>
         <w:t xml:space="preserve"> Reproducible evidence and later diagnostic plausibility tests require deterministic observations and a clear distinction between plant state and sensor output.</w:t>
+      </w:r>
+    </w:p>
+    <w:p>
+      <w:pPr>
+        <w:pStyle w:val="Heading2"/>
+        <w:keepNext/>
+        <w:keepLines/>
+      </w:pPr>
+      <w:r>
+        <w:t>ADR-DV-004 — Prefer Bounded Scenario Physics over Real-Time Fidelity</w:t>
+      </w:r>
+    </w:p>
+    <w:p>
+      <w:r>
+        <w:rPr>
+          <w:rFonts w:ascii="Calibri" w:hAnsi="Calibri"/>
+          <w:b/>
+          <w:color w:val="111827"/>
+          <w:sz w:val="22"/>
+        </w:rPr>
+        <w:t>Decision.</w:t>
+      </w:r>
+      <w:r>
+        <w:rPr>
+          <w:rFonts w:ascii="Calibri" w:hAnsi="Calibri"/>
+          <w:color w:val="111827"/>
+          <w:sz w:val="22"/>
+        </w:rPr>
+        <w:t xml:space="preserve"> Couple vehicle components through explicit, bounded, command-driven equations and publish their conservation evidence instead of introducing a wall-clock or high-fidelity solver.</w:t>
+      </w:r>
+    </w:p>
+    <w:p>
+      <w:r>
+        <w:rPr>
+          <w:rFonts w:ascii="Calibri" w:hAnsi="Calibri"/>
+          <w:b/>
+          <w:color w:val="111827"/>
+          <w:sz w:val="22"/>
+        </w:rPr>
+        <w:t>Rationale.</w:t>
+      </w:r>
+      <w:r>
+        <w:rPr>
+          <w:rFonts w:ascii="Calibri" w:hAnsi="Calibri"/>
+          <w:color w:val="111827"/>
+          <w:sz w:val="22"/>
+        </w:rPr>
+        <w:t xml:space="preserve"> The platform first needs repeatable automotive QA scenarios and explainable failures. Higher-fidelity models can replace individual equations later without changing API, replay, audit, or logical-time contracts.</w:t>
       </w:r>
     </w:p>
     <w:p>
@@ -8514,6 +9170,362 @@
           </w:p>
         </w:tc>
       </w:tr>
+      <w:tr>
+        <w:trPr>
+          <w:cantSplit/>
+        </w:trPr>
+        <w:tc>
+          <w:tcPr>
+            <w:tcW w:type="dxa" w:w="1650"/>
+            <w:tcMar>
+              <w:top w:w="80" w:type="dxa"/>
+              <w:start w:w="120" w:type="dxa"/>
+              <w:bottom w:w="80" w:type="dxa"/>
+              <w:end w:w="120" w:type="dxa"/>
+            </w:tcMar>
+            <w:vAlign w:val="center"/>
+            <w:shd w:fill="FFFFFF"/>
+          </w:tcPr>
+          <w:p>
+            <w:pPr>
+              <w:spacing w:before="0" w:after="40" w:line="252" w:lineRule="auto"/>
+              <w:jc w:val="center"/>
+            </w:pPr>
+            <w:r>
+              <w:rPr>
+                <w:rFonts w:ascii="Calibri" w:hAnsi="Calibri"/>
+                <w:b w:val="0"/>
+                <w:color w:val="111827"/>
+                <w:sz w:val="17"/>
+              </w:rPr>
+              <w:t>DV-T-023</w:t>
+            </w:r>
+          </w:p>
+        </w:tc>
+        <w:tc>
+          <w:tcPr>
+            <w:tcW w:type="dxa" w:w="4450"/>
+            <w:tcMar>
+              <w:top w:w="80" w:type="dxa"/>
+              <w:start w:w="120" w:type="dxa"/>
+              <w:bottom w:w="80" w:type="dxa"/>
+              <w:end w:w="120" w:type="dxa"/>
+            </w:tcMar>
+            <w:vAlign w:val="center"/>
+            <w:shd w:fill="FFFFFF"/>
+          </w:tcPr>
+          <w:p>
+            <w:pPr>
+              <w:spacing w:before="0" w:after="40" w:line="252" w:lineRule="auto"/>
+              <w:jc w:val="left"/>
+            </w:pPr>
+            <w:r>
+              <w:rPr>
+                <w:rFonts w:ascii="Calibri" w:hAnsi="Calibri"/>
+                <w:b w:val="0"/>
+                <w:color w:val="111827"/>
+                <w:sz w:val="17"/>
+              </w:rPr>
+              <w:t>Execute a drive-corner-brake scenario</w:t>
+            </w:r>
+          </w:p>
+        </w:tc>
+        <w:tc>
+          <w:tcPr>
+            <w:tcW w:type="dxa" w:w="3260"/>
+            <w:tcMar>
+              <w:top w:w="80" w:type="dxa"/>
+              <w:start w:w="120" w:type="dxa"/>
+              <w:bottom w:w="80" w:type="dxa"/>
+              <w:end w:w="120" w:type="dxa"/>
+            </w:tcMar>
+            <w:vAlign w:val="center"/>
+            <w:shd w:fill="FFFFFF"/>
+          </w:tcPr>
+          <w:p>
+            <w:pPr>
+              <w:spacing w:before="0" w:after="40" w:line="252" w:lineRule="auto"/>
+              <w:jc w:val="left"/>
+            </w:pPr>
+            <w:r>
+              <w:rPr>
+                <w:rFonts w:ascii="Calibri" w:hAnsi="Calibri"/>
+                <w:b w:val="0"/>
+                <w:color w:val="111827"/>
+                <w:sz w:val="17"/>
+              </w:rPr>
+              <w:t>Energy, torque, thermal, steering, suspension, and lighting outputs update together</w:t>
+            </w:r>
+          </w:p>
+        </w:tc>
+      </w:tr>
+      <w:tr>
+        <w:trPr>
+          <w:cantSplit/>
+        </w:trPr>
+        <w:tc>
+          <w:tcPr>
+            <w:tcW w:type="dxa" w:w="1650"/>
+            <w:tcMar>
+              <w:top w:w="80" w:type="dxa"/>
+              <w:start w:w="120" w:type="dxa"/>
+              <w:bottom w:w="80" w:type="dxa"/>
+              <w:end w:w="120" w:type="dxa"/>
+            </w:tcMar>
+            <w:vAlign w:val="center"/>
+            <w:shd w:fill="FFFFFF"/>
+          </w:tcPr>
+          <w:p>
+            <w:pPr>
+              <w:spacing w:before="0" w:after="40" w:line="252" w:lineRule="auto"/>
+              <w:jc w:val="center"/>
+            </w:pPr>
+            <w:r>
+              <w:rPr>
+                <w:rFonts w:ascii="Calibri" w:hAnsi="Calibri"/>
+                <w:b w:val="0"/>
+                <w:color w:val="111827"/>
+                <w:sz w:val="17"/>
+              </w:rPr>
+              <w:t>DV-T-024</w:t>
+            </w:r>
+          </w:p>
+        </w:tc>
+        <w:tc>
+          <w:tcPr>
+            <w:tcW w:type="dxa" w:w="4450"/>
+            <w:tcMar>
+              <w:top w:w="80" w:type="dxa"/>
+              <w:start w:w="120" w:type="dxa"/>
+              <w:bottom w:w="80" w:type="dxa"/>
+              <w:end w:w="120" w:type="dxa"/>
+            </w:tcMar>
+            <w:vAlign w:val="center"/>
+            <w:shd w:fill="FFFFFF"/>
+          </w:tcPr>
+          <w:p>
+            <w:pPr>
+              <w:spacing w:before="0" w:after="40" w:line="252" w:lineRule="auto"/>
+              <w:jc w:val="left"/>
+            </w:pPr>
+            <w:r>
+              <w:rPr>
+                <w:rFonts w:ascii="Calibri" w:hAnsi="Calibri"/>
+                <w:b w:val="0"/>
+                <w:color w:val="111827"/>
+                <w:sz w:val="17"/>
+              </w:rPr>
+              <w:t>Inspect used, recovered, and net Wh</w:t>
+            </w:r>
+          </w:p>
+        </w:tc>
+        <w:tc>
+          <w:tcPr>
+            <w:tcW w:type="dxa" w:w="3260"/>
+            <w:tcMar>
+              <w:top w:w="80" w:type="dxa"/>
+              <w:start w:w="120" w:type="dxa"/>
+              <w:bottom w:w="80" w:type="dxa"/>
+              <w:end w:w="120" w:type="dxa"/>
+            </w:tcMar>
+            <w:vAlign w:val="center"/>
+            <w:shd w:fill="FFFFFF"/>
+          </w:tcPr>
+          <w:p>
+            <w:pPr>
+              <w:spacing w:before="0" w:after="40" w:line="252" w:lineRule="auto"/>
+              <w:jc w:val="left"/>
+            </w:pPr>
+            <w:r>
+              <w:rPr>
+                <w:rFonts w:ascii="Calibri" w:hAnsi="Calibri"/>
+                <w:b w:val="0"/>
+                <w:color w:val="111827"/>
+                <w:sz w:val="17"/>
+              </w:rPr>
+              <w:t>Published values conserve energy at contract precision and recovery is bounded</w:t>
+            </w:r>
+          </w:p>
+        </w:tc>
+      </w:tr>
+      <w:tr>
+        <w:trPr>
+          <w:cantSplit/>
+        </w:trPr>
+        <w:tc>
+          <w:tcPr>
+            <w:tcW w:type="dxa" w:w="1650"/>
+            <w:tcMar>
+              <w:top w:w="80" w:type="dxa"/>
+              <w:start w:w="120" w:type="dxa"/>
+              <w:bottom w:w="80" w:type="dxa"/>
+              <w:end w:w="120" w:type="dxa"/>
+            </w:tcMar>
+            <w:vAlign w:val="center"/>
+            <w:shd w:fill="FFFFFF"/>
+          </w:tcPr>
+          <w:p>
+            <w:pPr>
+              <w:spacing w:before="0" w:after="40" w:line="252" w:lineRule="auto"/>
+              <w:jc w:val="center"/>
+            </w:pPr>
+            <w:r>
+              <w:rPr>
+                <w:rFonts w:ascii="Calibri" w:hAnsi="Calibri"/>
+                <w:b w:val="0"/>
+                <w:color w:val="111827"/>
+                <w:sz w:val="17"/>
+              </w:rPr>
+              <w:t>DV-T-025</w:t>
+            </w:r>
+          </w:p>
+        </w:tc>
+        <w:tc>
+          <w:tcPr>
+            <w:tcW w:type="dxa" w:w="4450"/>
+            <w:tcMar>
+              <w:top w:w="80" w:type="dxa"/>
+              <w:start w:w="120" w:type="dxa"/>
+              <w:bottom w:w="80" w:type="dxa"/>
+              <w:end w:w="120" w:type="dxa"/>
+            </w:tcMar>
+            <w:vAlign w:val="center"/>
+            <w:shd w:fill="FFFFFF"/>
+          </w:tcPr>
+          <w:p>
+            <w:pPr>
+              <w:spacing w:before="0" w:after="40" w:line="252" w:lineRule="auto"/>
+              <w:jc w:val="left"/>
+            </w:pPr>
+            <w:r>
+              <w:rPr>
+                <w:rFonts w:ascii="Calibri" w:hAnsi="Calibri"/>
+                <w:b w:val="0"/>
+                <w:color w:val="111827"/>
+                <w:sz w:val="17"/>
+              </w:rPr>
+              <w:t>Apply road, ambient, and roughness extremes</w:t>
+            </w:r>
+          </w:p>
+        </w:tc>
+        <w:tc>
+          <w:tcPr>
+            <w:tcW w:type="dxa" w:w="3260"/>
+            <w:tcMar>
+              <w:top w:w="80" w:type="dxa"/>
+              <w:start w:w="120" w:type="dxa"/>
+              <w:bottom w:w="80" w:type="dxa"/>
+              <w:end w:w="120" w:type="dxa"/>
+            </w:tcMar>
+            <w:vAlign w:val="center"/>
+            <w:shd w:fill="FFFFFF"/>
+          </w:tcPr>
+          <w:p>
+            <w:pPr>
+              <w:spacing w:before="0" w:after="40" w:line="252" w:lineRule="auto"/>
+              <w:jc w:val="left"/>
+            </w:pPr>
+            <w:r>
+              <w:rPr>
+                <w:rFonts w:ascii="Calibri" w:hAnsi="Calibri"/>
+                <w:b w:val="0"/>
+                <w:color w:val="111827"/>
+                <w:sz w:val="17"/>
+              </w:rPr>
+              <w:t>All component states remain inside declared limits</w:t>
+            </w:r>
+          </w:p>
+        </w:tc>
+      </w:tr>
+      <w:tr>
+        <w:trPr>
+          <w:cantSplit/>
+        </w:trPr>
+        <w:tc>
+          <w:tcPr>
+            <w:tcW w:type="dxa" w:w="1650"/>
+            <w:tcMar>
+              <w:top w:w="80" w:type="dxa"/>
+              <w:start w:w="120" w:type="dxa"/>
+              <w:bottom w:w="80" w:type="dxa"/>
+              <w:end w:w="120" w:type="dxa"/>
+            </w:tcMar>
+            <w:vAlign w:val="center"/>
+            <w:shd w:fill="FFFFFF"/>
+          </w:tcPr>
+          <w:p>
+            <w:pPr>
+              <w:spacing w:before="0" w:after="40" w:line="252" w:lineRule="auto"/>
+              <w:jc w:val="center"/>
+            </w:pPr>
+            <w:r>
+              <w:rPr>
+                <w:rFonts w:ascii="Calibri" w:hAnsi="Calibri"/>
+                <w:b w:val="0"/>
+                <w:color w:val="111827"/>
+                <w:sz w:val="17"/>
+              </w:rPr>
+              <w:t>DV-T-026</w:t>
+            </w:r>
+          </w:p>
+        </w:tc>
+        <w:tc>
+          <w:tcPr>
+            <w:tcW w:type="dxa" w:w="4450"/>
+            <w:tcMar>
+              <w:top w:w="80" w:type="dxa"/>
+              <w:start w:w="120" w:type="dxa"/>
+              <w:bottom w:w="80" w:type="dxa"/>
+              <w:end w:w="120" w:type="dxa"/>
+            </w:tcMar>
+            <w:vAlign w:val="center"/>
+            <w:shd w:fill="FFFFFF"/>
+          </w:tcPr>
+          <w:p>
+            <w:pPr>
+              <w:spacing w:before="0" w:after="40" w:line="252" w:lineRule="auto"/>
+              <w:jc w:val="left"/>
+            </w:pPr>
+            <w:r>
+              <w:rPr>
+                <w:rFonts w:ascii="Calibri" w:hAnsi="Calibri"/>
+                <w:b w:val="0"/>
+                <w:color w:val="111827"/>
+                <w:sz w:val="17"/>
+              </w:rPr>
+              <w:t>Apply migration 0016</w:t>
+            </w:r>
+          </w:p>
+        </w:tc>
+        <w:tc>
+          <w:tcPr>
+            <w:tcW w:type="dxa" w:w="3260"/>
+            <w:tcMar>
+              <w:top w:w="80" w:type="dxa"/>
+              <w:start w:w="120" w:type="dxa"/>
+              <w:bottom w:w="80" w:type="dxa"/>
+              <w:end w:w="120" w:type="dxa"/>
+            </w:tcMar>
+            <w:vAlign w:val="center"/>
+            <w:shd w:fill="FFFFFF"/>
+          </w:tcPr>
+          <w:p>
+            <w:pPr>
+              <w:spacing w:before="0" w:after="40" w:line="252" w:lineRule="auto"/>
+              <w:jc w:val="left"/>
+            </w:pPr>
+            <w:r>
+              <w:rPr>
+                <w:rFonts w:ascii="Calibri" w:hAnsi="Calibri"/>
+                <w:b w:val="0"/>
+                <w:color w:val="111827"/>
+                <w:sz w:val="17"/>
+              </w:rPr>
+              <w:t>Existing states receive the safe suspension baseline and schema reaches head</w:t>
+            </w:r>
+          </w:p>
+        </w:tc>
+      </w:tr>
     </w:tbl>
     <w:p>
       <w:pPr>
@@ -9440,7 +10452,7 @@
                 <w:color w:val="111827"/>
                 <w:sz w:val="17"/>
               </w:rPr>
-              <w:t>Initial equations are intentionally simple</w:t>
+              <w:t>Equations are intentionally scenario-oriented</w:t>
             </w:r>
           </w:p>
         </w:tc>
@@ -9468,7 +10480,7 @@
                 <w:color w:val="111827"/>
                 <w:sz w:val="17"/>
               </w:rPr>
-              <w:t>Results are deterministic but not yet physically representative</w:t>
+              <w:t>Results are deterministic but not a substitute for validated tyre, chassis, or thermal solvers</w:t>
             </w:r>
           </w:p>
         </w:tc>
@@ -9496,96 +10508,7 @@
                 <w:color w:val="111827"/>
                 <w:sz w:val="17"/>
               </w:rPr>
-              <w:t>Add coupled energy, thermal, powertrain, braking, steering, suspension, and lighting behavior in II-4</w:t>
-            </w:r>
-          </w:p>
-        </w:tc>
-      </w:tr>
-      <w:tr>
-        <w:trPr>
-          <w:cantSplit/>
-        </w:trPr>
-        <w:tc>
-          <w:tcPr>
-            <w:tcW w:type="dxa" w:w="1650"/>
-            <w:tcMar>
-              <w:top w:w="80" w:type="dxa"/>
-              <w:start w:w="120" w:type="dxa"/>
-              <w:bottom w:w="80" w:type="dxa"/>
-              <w:end w:w="120" w:type="dxa"/>
-            </w:tcMar>
-            <w:vAlign w:val="center"/>
-            <w:shd w:fill="FFFFFF"/>
-          </w:tcPr>
-          <w:p>
-            <w:pPr>
-              <w:spacing w:before="0" w:after="40" w:line="252" w:lineRule="auto"/>
-              <w:jc w:val="center"/>
-            </w:pPr>
-            <w:r>
-              <w:rPr>
-                <w:rFonts w:ascii="Calibri" w:hAnsi="Calibri"/>
-                <w:b w:val="0"/>
-                <w:color w:val="111827"/>
-                <w:sz w:val="17"/>
-              </w:rPr>
-              <w:t>No suspension component exists yet</w:t>
-            </w:r>
-          </w:p>
-        </w:tc>
-        <w:tc>
-          <w:tcPr>
-            <w:tcW w:type="dxa" w:w="4450"/>
-            <w:tcMar>
-              <w:top w:w="80" w:type="dxa"/>
-              <w:start w:w="120" w:type="dxa"/>
-              <w:bottom w:w="80" w:type="dxa"/>
-              <w:end w:w="120" w:type="dxa"/>
-            </w:tcMar>
-            <w:vAlign w:val="center"/>
-            <w:shd w:fill="FFFFFF"/>
-          </w:tcPr>
-          <w:p>
-            <w:pPr>
-              <w:spacing w:before="0" w:after="40" w:line="252" w:lineRule="auto"/>
-              <w:jc w:val="left"/>
-            </w:pPr>
-            <w:r>
-              <w:rPr>
-                <w:rFonts w:ascii="Calibri" w:hAnsi="Calibri"/>
-                <w:b w:val="0"/>
-                <w:color w:val="111827"/>
-                <w:sz w:val="17"/>
-              </w:rPr>
-              <w:t>Full-vehicle chassis behavior is incomplete</w:t>
-            </w:r>
-          </w:p>
-        </w:tc>
-        <w:tc>
-          <w:tcPr>
-            <w:tcW w:type="dxa" w:w="3260"/>
-            <w:tcMar>
-              <w:top w:w="80" w:type="dxa"/>
-              <w:start w:w="120" w:type="dxa"/>
-              <w:bottom w:w="80" w:type="dxa"/>
-              <w:end w:w="120" w:type="dxa"/>
-            </w:tcMar>
-            <w:vAlign w:val="center"/>
-            <w:shd w:fill="FFFFFF"/>
-          </w:tcPr>
-          <w:p>
-            <w:pPr>
-              <w:spacing w:before="0" w:after="40" w:line="252" w:lineRule="auto"/>
-              <w:jc w:val="left"/>
-            </w:pPr>
-            <w:r>
-              <w:rPr>
-                <w:rFonts w:ascii="Calibri" w:hAnsi="Calibri"/>
-                <w:b w:val="0"/>
-                <w:color w:val="111827"/>
-                <w:sz w:val="17"/>
-              </w:rPr>
-              <w:t>Introduce bounded suspension state and scenario tests in II-4</w:t>
+              <w:t>Calibrate or replace component equations behind stable contracts when higher fidelity is required</w:t>
             </w:r>
           </w:p>
         </w:tc>
@@ -10335,7 +11258,7 @@
                 <w:color w:val="111827"/>
                 <w:sz w:val="17"/>
               </w:rPr>
-              <w:t>Planned next</w:t>
+              <w:t>Implemented</w:t>
             </w:r>
           </w:p>
         </w:tc>
@@ -10424,7 +11347,7 @@
                 <w:color w:val="111827"/>
                 <w:sz w:val="17"/>
               </w:rPr>
-              <w:t>Planned</w:t>
+              <w:t>Planned next</w:t>
             </w:r>
           </w:p>
         </w:tc>
@@ -10665,7 +11588,7 @@
         <w:color w:val="667085"/>
         <w:sz w:val="17"/>
       </w:rPr>
-      <w:t>ATEP Volume II Workbook  |  Version 0.3.0</w:t>
+      <w:t>ATEP Volume II Workbook  |  Version 0.4.0</w:t>
     </w:r>
     <w:r>
       <w:rPr>

</xml_diff>

<commit_message>
Add multi-vehicle simulation sessions
</commit_message>
<xml_diff>
--- a/docs/ATEP_Volume_II_Digital_Vehicle_Engineering_Workbook.docx
+++ b/docs/ATEP_Volume_II_Digital_Vehicle_Engineering_Workbook.docx
@@ -143,7 +143,7 @@
                 <w:color w:val="0B2545"/>
                 <w:sz w:val="19"/>
               </w:rPr>
-              <w:t>0.4.0</w:t>
+              <w:t>0.5.0</w:t>
             </w:r>
           </w:p>
         </w:tc>
@@ -265,7 +265,7 @@
                 <w:color w:val="111827"/>
                 <w:sz w:val="19"/>
               </w:rPr>
-              <w:t>Living document - Increments II-1 through II-4 implemented</w:t>
+              <w:t>Living document - Increments II-1 through II-5 implemented</w:t>
             </w:r>
           </w:p>
         </w:tc>
@@ -1733,6 +1733,123 @@
           </w:p>
         </w:tc>
       </w:tr>
+      <w:tr>
+        <w:trPr>
+          <w:cantSplit/>
+        </w:trPr>
+        <w:tc>
+          <w:tcPr>
+            <w:tcW w:type="dxa" w:w="1150"/>
+            <w:tcMar>
+              <w:top w:w="80" w:type="dxa"/>
+              <w:start w:w="120" w:type="dxa"/>
+              <w:bottom w:w="80" w:type="dxa"/>
+              <w:end w:w="120" w:type="dxa"/>
+            </w:tcMar>
+            <w:vAlign w:val="center"/>
+            <w:shd w:fill="FFFFFF"/>
+          </w:tcPr>
+          <w:p>
+            <w:pPr>
+              <w:spacing w:before="0" w:after="40" w:line="252" w:lineRule="auto"/>
+              <w:jc w:val="center"/>
+            </w:pPr>
+            <w:r>
+              <w:rPr>
+                <w:rFonts w:ascii="Calibri" w:hAnsi="Calibri"/>
+                <w:b w:val="0"/>
+                <w:color w:val="111827"/>
+                <w:sz w:val="16"/>
+              </w:rPr>
+              <w:t>0.5.0</w:t>
+            </w:r>
+          </w:p>
+        </w:tc>
+        <w:tc>
+          <w:tcPr>
+            <w:tcW w:type="dxa" w:w="1400"/>
+            <w:tcMar>
+              <w:top w:w="80" w:type="dxa"/>
+              <w:start w:w="120" w:type="dxa"/>
+              <w:bottom w:w="80" w:type="dxa"/>
+              <w:end w:w="120" w:type="dxa"/>
+            </w:tcMar>
+            <w:vAlign w:val="center"/>
+            <w:shd w:fill="FFFFFF"/>
+          </w:tcPr>
+          <w:p>
+            <w:pPr>
+              <w:spacing w:before="0" w:after="40" w:line="252" w:lineRule="auto"/>
+              <w:jc w:val="left"/>
+            </w:pPr>
+            <w:r>
+              <w:rPr>
+                <w:rFonts w:ascii="Calibri" w:hAnsi="Calibri"/>
+                <w:b w:val="0"/>
+                <w:color w:val="111827"/>
+                <w:sz w:val="16"/>
+              </w:rPr>
+              <w:t>12 August 2026</w:t>
+            </w:r>
+          </w:p>
+        </w:tc>
+        <w:tc>
+          <w:tcPr>
+            <w:tcW w:type="dxa" w:w="3450"/>
+            <w:tcMar>
+              <w:top w:w="80" w:type="dxa"/>
+              <w:start w:w="120" w:type="dxa"/>
+              <w:bottom w:w="80" w:type="dxa"/>
+              <w:end w:w="120" w:type="dxa"/>
+            </w:tcMar>
+            <w:vAlign w:val="center"/>
+            <w:shd w:fill="FFFFFF"/>
+          </w:tcPr>
+          <w:p>
+            <w:pPr>
+              <w:spacing w:before="0" w:after="40" w:line="252" w:lineRule="auto"/>
+              <w:jc w:val="left"/>
+            </w:pPr>
+            <w:r>
+              <w:rPr>
+                <w:rFonts w:ascii="Calibri" w:hAnsi="Calibri"/>
+                <w:b w:val="0"/>
+                <w:color w:val="111827"/>
+                <w:sz w:val="16"/>
+              </w:rPr>
+              <w:t>II-5: added bounded multi-vehicle sessions, canonical immutable snapshots, SHA-256 content identity, and isolated deterministic restore</w:t>
+            </w:r>
+          </w:p>
+        </w:tc>
+        <w:tc>
+          <w:tcPr>
+            <w:tcW w:type="dxa" w:w="3360"/>
+            <w:tcMar>
+              <w:top w:w="80" w:type="dxa"/>
+              <w:start w:w="120" w:type="dxa"/>
+              <w:bottom w:w="80" w:type="dxa"/>
+              <w:end w:w="120" w:type="dxa"/>
+            </w:tcMar>
+            <w:vAlign w:val="center"/>
+            <w:shd w:fill="FFFFFF"/>
+          </w:tcPr>
+          <w:p>
+            <w:pPr>
+              <w:spacing w:before="0" w:after="40" w:line="252" w:lineRule="auto"/>
+              <w:jc w:val="left"/>
+            </w:pPr>
+            <w:r>
+              <w:rPr>
+                <w:rFonts w:ascii="Calibri" w:hAnsi="Calibri"/>
+                <w:b w:val="0"/>
+                <w:color w:val="111827"/>
+                <w:sz w:val="16"/>
+              </w:rPr>
+              <w:t>Implemented and verified by bounds, canonicalization, isolation, reset/replay, contract, migration, and hosted integration tests</w:t>
+            </w:r>
+          </w:p>
+        </w:tc>
+      </w:tr>
     </w:tbl>
     <w:p>
       <w:pPr>
@@ -3861,6 +3978,362 @@
           </w:p>
         </w:tc>
       </w:tr>
+      <w:tr>
+        <w:trPr>
+          <w:cantSplit/>
+        </w:trPr>
+        <w:tc>
+          <w:tcPr>
+            <w:tcW w:type="dxa" w:w="1650"/>
+            <w:tcMar>
+              <w:top w:w="80" w:type="dxa"/>
+              <w:start w:w="120" w:type="dxa"/>
+              <w:bottom w:w="80" w:type="dxa"/>
+              <w:end w:w="120" w:type="dxa"/>
+            </w:tcMar>
+            <w:vAlign w:val="center"/>
+            <w:shd w:fill="FFFFFF"/>
+          </w:tcPr>
+          <w:p>
+            <w:pPr>
+              <w:spacing w:before="0" w:after="40" w:line="252" w:lineRule="auto"/>
+              <w:jc w:val="center"/>
+            </w:pPr>
+            <w:r>
+              <w:rPr>
+                <w:rFonts w:ascii="Calibri" w:hAnsi="Calibri"/>
+                <w:b w:val="0"/>
+                <w:color w:val="111827"/>
+                <w:sz w:val="17"/>
+              </w:rPr>
+              <w:t>POST /api/v1/simulation-sessions</w:t>
+            </w:r>
+          </w:p>
+        </w:tc>
+        <w:tc>
+          <w:tcPr>
+            <w:tcW w:type="dxa" w:w="4450"/>
+            <w:tcMar>
+              <w:top w:w="80" w:type="dxa"/>
+              <w:start w:w="120" w:type="dxa"/>
+              <w:bottom w:w="80" w:type="dxa"/>
+              <w:end w:w="120" w:type="dxa"/>
+            </w:tcMar>
+            <w:vAlign w:val="center"/>
+            <w:shd w:fill="FFFFFF"/>
+          </w:tcPr>
+          <w:p>
+            <w:pPr>
+              <w:spacing w:before="0" w:after="40" w:line="252" w:lineRule="auto"/>
+              <w:jc w:val="left"/>
+            </w:pPr>
+            <w:r>
+              <w:rPr>
+                <w:rFonts w:ascii="Calibri" w:hAnsi="Calibri"/>
+                <w:b w:val="0"/>
+                <w:color w:val="111827"/>
+                <w:sz w:val="17"/>
+              </w:rPr>
+              <w:t>digital_vehicle:write</w:t>
+            </w:r>
+          </w:p>
+        </w:tc>
+        <w:tc>
+          <w:tcPr>
+            <w:tcW w:type="dxa" w:w="3260"/>
+            <w:tcMar>
+              <w:top w:w="80" w:type="dxa"/>
+              <w:start w:w="120" w:type="dxa"/>
+              <w:bottom w:w="80" w:type="dxa"/>
+              <w:end w:w="120" w:type="dxa"/>
+            </w:tcMar>
+            <w:vAlign w:val="center"/>
+            <w:shd w:fill="FFFFFF"/>
+          </w:tcPr>
+          <w:p>
+            <w:pPr>
+              <w:spacing w:before="0" w:after="40" w:line="252" w:lineRule="auto"/>
+              <w:jc w:val="left"/>
+            </w:pPr>
+            <w:r>
+              <w:rPr>
+                <w:rFonts w:ascii="Calibri" w:hAnsi="Calibri"/>
+                <w:b w:val="0"/>
+                <w:color w:val="111827"/>
+                <w:sz w:val="17"/>
+              </w:rPr>
+              <w:t>Create a bounded unique multi-vehicle composition</w:t>
+            </w:r>
+          </w:p>
+        </w:tc>
+      </w:tr>
+      <w:tr>
+        <w:trPr>
+          <w:cantSplit/>
+        </w:trPr>
+        <w:tc>
+          <w:tcPr>
+            <w:tcW w:type="dxa" w:w="1650"/>
+            <w:tcMar>
+              <w:top w:w="80" w:type="dxa"/>
+              <w:start w:w="120" w:type="dxa"/>
+              <w:bottom w:w="80" w:type="dxa"/>
+              <w:end w:w="120" w:type="dxa"/>
+            </w:tcMar>
+            <w:vAlign w:val="center"/>
+            <w:shd w:fill="FFFFFF"/>
+          </w:tcPr>
+          <w:p>
+            <w:pPr>
+              <w:spacing w:before="0" w:after="40" w:line="252" w:lineRule="auto"/>
+              <w:jc w:val="center"/>
+            </w:pPr>
+            <w:r>
+              <w:rPr>
+                <w:rFonts w:ascii="Calibri" w:hAnsi="Calibri"/>
+                <w:b w:val="0"/>
+                <w:color w:val="111827"/>
+                <w:sz w:val="17"/>
+              </w:rPr>
+              <w:t>GET /api/v1/simulation-sessions/{session_id}</w:t>
+            </w:r>
+          </w:p>
+        </w:tc>
+        <w:tc>
+          <w:tcPr>
+            <w:tcW w:type="dxa" w:w="4450"/>
+            <w:tcMar>
+              <w:top w:w="80" w:type="dxa"/>
+              <w:start w:w="120" w:type="dxa"/>
+              <w:bottom w:w="80" w:type="dxa"/>
+              <w:end w:w="120" w:type="dxa"/>
+            </w:tcMar>
+            <w:vAlign w:val="center"/>
+            <w:shd w:fill="FFFFFF"/>
+          </w:tcPr>
+          <w:p>
+            <w:pPr>
+              <w:spacing w:before="0" w:after="40" w:line="252" w:lineRule="auto"/>
+              <w:jc w:val="left"/>
+            </w:pPr>
+            <w:r>
+              <w:rPr>
+                <w:rFonts w:ascii="Calibri" w:hAnsi="Calibri"/>
+                <w:b w:val="0"/>
+                <w:color w:val="111827"/>
+                <w:sz w:val="17"/>
+              </w:rPr>
+              <w:t>digital_vehicle:read</w:t>
+            </w:r>
+          </w:p>
+        </w:tc>
+        <w:tc>
+          <w:tcPr>
+            <w:tcW w:type="dxa" w:w="3260"/>
+            <w:tcMar>
+              <w:top w:w="80" w:type="dxa"/>
+              <w:start w:w="120" w:type="dxa"/>
+              <w:bottom w:w="80" w:type="dxa"/>
+              <w:end w:w="120" w:type="dxa"/>
+            </w:tcMar>
+            <w:vAlign w:val="center"/>
+            <w:shd w:fill="FFFFFF"/>
+          </w:tcPr>
+          <w:p>
+            <w:pPr>
+              <w:spacing w:before="0" w:after="40" w:line="252" w:lineRule="auto"/>
+              <w:jc w:val="left"/>
+            </w:pPr>
+            <w:r>
+              <w:rPr>
+                <w:rFonts w:ascii="Calibri" w:hAnsi="Calibri"/>
+                <w:b w:val="0"/>
+                <w:color w:val="111827"/>
+                <w:sz w:val="17"/>
+              </w:rPr>
+              <w:t>Inspect session composition</w:t>
+            </w:r>
+          </w:p>
+        </w:tc>
+      </w:tr>
+      <w:tr>
+        <w:trPr>
+          <w:cantSplit/>
+        </w:trPr>
+        <w:tc>
+          <w:tcPr>
+            <w:tcW w:type="dxa" w:w="1650"/>
+            <w:tcMar>
+              <w:top w:w="80" w:type="dxa"/>
+              <w:start w:w="120" w:type="dxa"/>
+              <w:bottom w:w="80" w:type="dxa"/>
+              <w:end w:w="120" w:type="dxa"/>
+            </w:tcMar>
+            <w:vAlign w:val="center"/>
+            <w:shd w:fill="FFFFFF"/>
+          </w:tcPr>
+          <w:p>
+            <w:pPr>
+              <w:spacing w:before="0" w:after="40" w:line="252" w:lineRule="auto"/>
+              <w:jc w:val="center"/>
+            </w:pPr>
+            <w:r>
+              <w:rPr>
+                <w:rFonts w:ascii="Calibri" w:hAnsi="Calibri"/>
+                <w:b w:val="0"/>
+                <w:color w:val="111827"/>
+                <w:sz w:val="17"/>
+              </w:rPr>
+              <w:t>POST /api/v1/simulation-sessions/{session_id}/snapshots</w:t>
+            </w:r>
+          </w:p>
+        </w:tc>
+        <w:tc>
+          <w:tcPr>
+            <w:tcW w:type="dxa" w:w="4450"/>
+            <w:tcMar>
+              <w:top w:w="80" w:type="dxa"/>
+              <w:start w:w="120" w:type="dxa"/>
+              <w:bottom w:w="80" w:type="dxa"/>
+              <w:end w:w="120" w:type="dxa"/>
+            </w:tcMar>
+            <w:vAlign w:val="center"/>
+            <w:shd w:fill="FFFFFF"/>
+          </w:tcPr>
+          <w:p>
+            <w:pPr>
+              <w:spacing w:before="0" w:after="40" w:line="252" w:lineRule="auto"/>
+              <w:jc w:val="left"/>
+            </w:pPr>
+            <w:r>
+              <w:rPr>
+                <w:rFonts w:ascii="Calibri" w:hAnsi="Calibri"/>
+                <w:b w:val="0"/>
+                <w:color w:val="111827"/>
+                <w:sz w:val="17"/>
+              </w:rPr>
+              <w:t>digital_vehicle:write</w:t>
+            </w:r>
+          </w:p>
+        </w:tc>
+        <w:tc>
+          <w:tcPr>
+            <w:tcW w:type="dxa" w:w="3260"/>
+            <w:tcMar>
+              <w:top w:w="80" w:type="dxa"/>
+              <w:start w:w="120" w:type="dxa"/>
+              <w:bottom w:w="80" w:type="dxa"/>
+              <w:end w:w="120" w:type="dxa"/>
+            </w:tcMar>
+            <w:vAlign w:val="center"/>
+            <w:shd w:fill="FFFFFF"/>
+          </w:tcPr>
+          <w:p>
+            <w:pPr>
+              <w:spacing w:before="0" w:after="40" w:line="252" w:lineRule="auto"/>
+              <w:jc w:val="left"/>
+            </w:pPr>
+            <w:r>
+              <w:rPr>
+                <w:rFonts w:ascii="Calibri" w:hAnsi="Calibri"/>
+                <w:b w:val="0"/>
+                <w:color w:val="111827"/>
+                <w:sz w:val="17"/>
+              </w:rPr>
+              <w:t>Capture a canonical immutable snapshot</w:t>
+            </w:r>
+          </w:p>
+        </w:tc>
+      </w:tr>
+      <w:tr>
+        <w:trPr>
+          <w:cantSplit/>
+        </w:trPr>
+        <w:tc>
+          <w:tcPr>
+            <w:tcW w:type="dxa" w:w="1650"/>
+            <w:tcMar>
+              <w:top w:w="80" w:type="dxa"/>
+              <w:start w:w="120" w:type="dxa"/>
+              <w:bottom w:w="80" w:type="dxa"/>
+              <w:end w:w="120" w:type="dxa"/>
+            </w:tcMar>
+            <w:vAlign w:val="center"/>
+            <w:shd w:fill="FFFFFF"/>
+          </w:tcPr>
+          <w:p>
+            <w:pPr>
+              <w:spacing w:before="0" w:after="40" w:line="252" w:lineRule="auto"/>
+              <w:jc w:val="center"/>
+            </w:pPr>
+            <w:r>
+              <w:rPr>
+                <w:rFonts w:ascii="Calibri" w:hAnsi="Calibri"/>
+                <w:b w:val="0"/>
+                <w:color w:val="111827"/>
+                <w:sz w:val="17"/>
+              </w:rPr>
+              <w:t>POST /api/v1/simulation-sessions/{session_id}/snapshots/{snapshot_id}/restore</w:t>
+            </w:r>
+          </w:p>
+        </w:tc>
+        <w:tc>
+          <w:tcPr>
+            <w:tcW w:type="dxa" w:w="4450"/>
+            <w:tcMar>
+              <w:top w:w="80" w:type="dxa"/>
+              <w:start w:w="120" w:type="dxa"/>
+              <w:bottom w:w="80" w:type="dxa"/>
+              <w:end w:w="120" w:type="dxa"/>
+            </w:tcMar>
+            <w:vAlign w:val="center"/>
+            <w:shd w:fill="FFFFFF"/>
+          </w:tcPr>
+          <w:p>
+            <w:pPr>
+              <w:spacing w:before="0" w:after="40" w:line="252" w:lineRule="auto"/>
+              <w:jc w:val="left"/>
+            </w:pPr>
+            <w:r>
+              <w:rPr>
+                <w:rFonts w:ascii="Calibri" w:hAnsi="Calibri"/>
+                <w:b w:val="0"/>
+                <w:color w:val="111827"/>
+                <w:sz w:val="17"/>
+              </w:rPr>
+              <w:t>digital_vehicle:write</w:t>
+            </w:r>
+          </w:p>
+        </w:tc>
+        <w:tc>
+          <w:tcPr>
+            <w:tcW w:type="dxa" w:w="3260"/>
+            <w:tcMar>
+              <w:top w:w="80" w:type="dxa"/>
+              <w:start w:w="120" w:type="dxa"/>
+              <w:bottom w:w="80" w:type="dxa"/>
+              <w:end w:w="120" w:type="dxa"/>
+            </w:tcMar>
+            <w:vAlign w:val="center"/>
+            <w:shd w:fill="FFFFFF"/>
+          </w:tcPr>
+          <w:p>
+            <w:pPr>
+              <w:spacing w:before="0" w:after="40" w:line="252" w:lineRule="auto"/>
+              <w:jc w:val="left"/>
+            </w:pPr>
+            <w:r>
+              <w:rPr>
+                <w:rFonts w:ascii="Calibri" w:hAnsi="Calibri"/>
+                <w:b w:val="0"/>
+                <w:color w:val="111827"/>
+                <w:sz w:val="17"/>
+              </w:rPr>
+              <w:t>Restore isolated member state and logical time</w:t>
+            </w:r>
+          </w:p>
+        </w:tc>
+      </w:tr>
     </w:tbl>
     <w:p>
       <w:pPr>
@@ -4043,6 +4516,36 @@
           <w:sz w:val="22"/>
         </w:rPr>
         <w:t>Torque includes grade demand and braking regeneration. Battery temperature combines load heating and ambient cooling. Steering and speed produce bounded lateral acceleration; roughness, braking, and acceleration produce front/rear suspension travel. Brake lamps and low-beam behavior follow brake and ambient-light inputs.</w:t>
+      </w:r>
+    </w:p>
+    <w:p>
+      <w:pPr>
+        <w:pStyle w:val="Heading2"/>
+        <w:keepNext/>
+        <w:keepLines/>
+      </w:pPr>
+      <w:r>
+        <w:t>6.5 Multi-Vehicle Sessions</w:t>
+      </w:r>
+    </w:p>
+    <w:p>
+      <w:r>
+        <w:rPr>
+          <w:rFonts w:ascii="Calibri" w:hAnsi="Calibri"/>
+          <w:color w:val="111827"/>
+          <w:sz w:val="22"/>
+        </w:rPr>
+        <w:t>A session contains 1-20 unique registered vehicles. Snapshot state is ordered canonically by vehicle identifier before serialization and hashing. The immutable snapshot stores aggregate versions, logical times, component state, and a SHA-256 content identity.</w:t>
+      </w:r>
+    </w:p>
+    <w:p>
+      <w:r>
+        <w:rPr>
+          <w:rFonts w:ascii="Calibri" w:hAnsi="Calibri"/>
+          <w:color w:val="111827"/>
+          <w:sz w:val="22"/>
+        </w:rPr>
+        <w:t>Restore selects and locks matching vehicles deterministically, maps each state by vehicle identifier, restores its saved logical time, and increments the current aggregate version. It never copies state between members. Creation, snapshot, and restore append bounded audit and outbox evidence in the same transaction.</w:t>
       </w:r>
     </w:p>
     <w:p>
@@ -5923,6 +6426,273 @@
           </w:p>
         </w:tc>
       </w:tr>
+      <w:tr>
+        <w:trPr>
+          <w:cantSplit/>
+        </w:trPr>
+        <w:tc>
+          <w:tcPr>
+            <w:tcW w:type="dxa" w:w="1650"/>
+            <w:tcMar>
+              <w:top w:w="80" w:type="dxa"/>
+              <w:start w:w="120" w:type="dxa"/>
+              <w:bottom w:w="80" w:type="dxa"/>
+              <w:end w:w="120" w:type="dxa"/>
+            </w:tcMar>
+            <w:vAlign w:val="center"/>
+            <w:shd w:fill="FFFFFF"/>
+          </w:tcPr>
+          <w:p>
+            <w:pPr>
+              <w:spacing w:before="0" w:after="40" w:line="252" w:lineRule="auto"/>
+              <w:jc w:val="center"/>
+            </w:pPr>
+            <w:r>
+              <w:rPr>
+                <w:rFonts w:ascii="Calibri" w:hAnsi="Calibri"/>
+                <w:b w:val="0"/>
+                <w:color w:val="111827"/>
+                <w:sz w:val="17"/>
+              </w:rPr>
+              <w:t>DV-F-019</w:t>
+            </w:r>
+          </w:p>
+        </w:tc>
+        <w:tc>
+          <w:tcPr>
+            <w:tcW w:type="dxa" w:w="4450"/>
+            <w:tcMar>
+              <w:top w:w="80" w:type="dxa"/>
+              <w:start w:w="120" w:type="dxa"/>
+              <w:bottom w:w="80" w:type="dxa"/>
+              <w:end w:w="120" w:type="dxa"/>
+            </w:tcMar>
+            <w:vAlign w:val="center"/>
+            <w:shd w:fill="FFFFFF"/>
+          </w:tcPr>
+          <w:p>
+            <w:pPr>
+              <w:spacing w:before="0" w:after="40" w:line="252" w:lineRule="auto"/>
+              <w:jc w:val="left"/>
+            </w:pPr>
+            <w:r>
+              <w:rPr>
+                <w:rFonts w:ascii="Calibri" w:hAnsi="Calibri"/>
+                <w:b w:val="0"/>
+                <w:color w:val="111827"/>
+                <w:sz w:val="17"/>
+              </w:rPr>
+              <w:t>Sessions shall contain 1-20 unique registered vehicles.</w:t>
+            </w:r>
+          </w:p>
+        </w:tc>
+        <w:tc>
+          <w:tcPr>
+            <w:tcW w:type="dxa" w:w="3260"/>
+            <w:tcMar>
+              <w:top w:w="80" w:type="dxa"/>
+              <w:start w:w="120" w:type="dxa"/>
+              <w:bottom w:w="80" w:type="dxa"/>
+              <w:end w:w="120" w:type="dxa"/>
+            </w:tcMar>
+            <w:vAlign w:val="center"/>
+            <w:shd w:fill="FFFFFF"/>
+          </w:tcPr>
+          <w:p>
+            <w:pPr>
+              <w:spacing w:before="0" w:after="40" w:line="252" w:lineRule="auto"/>
+              <w:jc w:val="left"/>
+            </w:pPr>
+            <w:r>
+              <w:rPr>
+                <w:rFonts w:ascii="Calibri" w:hAnsi="Calibri"/>
+                <w:b w:val="0"/>
+                <w:color w:val="111827"/>
+                <w:sz w:val="17"/>
+              </w:rPr>
+              <w:t>Contract and creation tests</w:t>
+            </w:r>
+          </w:p>
+        </w:tc>
+      </w:tr>
+      <w:tr>
+        <w:trPr>
+          <w:cantSplit/>
+        </w:trPr>
+        <w:tc>
+          <w:tcPr>
+            <w:tcW w:type="dxa" w:w="1650"/>
+            <w:tcMar>
+              <w:top w:w="80" w:type="dxa"/>
+              <w:start w:w="120" w:type="dxa"/>
+              <w:bottom w:w="80" w:type="dxa"/>
+              <w:end w:w="120" w:type="dxa"/>
+            </w:tcMar>
+            <w:vAlign w:val="center"/>
+            <w:shd w:fill="FFFFFF"/>
+          </w:tcPr>
+          <w:p>
+            <w:pPr>
+              <w:spacing w:before="0" w:after="40" w:line="252" w:lineRule="auto"/>
+              <w:jc w:val="center"/>
+            </w:pPr>
+            <w:r>
+              <w:rPr>
+                <w:rFonts w:ascii="Calibri" w:hAnsi="Calibri"/>
+                <w:b w:val="0"/>
+                <w:color w:val="111827"/>
+                <w:sz w:val="17"/>
+              </w:rPr>
+              <w:t>DV-F-020</w:t>
+            </w:r>
+          </w:p>
+        </w:tc>
+        <w:tc>
+          <w:tcPr>
+            <w:tcW w:type="dxa" w:w="4450"/>
+            <w:tcMar>
+              <w:top w:w="80" w:type="dxa"/>
+              <w:start w:w="120" w:type="dxa"/>
+              <w:bottom w:w="80" w:type="dxa"/>
+              <w:end w:w="120" w:type="dxa"/>
+            </w:tcMar>
+            <w:vAlign w:val="center"/>
+            <w:shd w:fill="FFFFFF"/>
+          </w:tcPr>
+          <w:p>
+            <w:pPr>
+              <w:spacing w:before="0" w:after="40" w:line="252" w:lineRule="auto"/>
+              <w:jc w:val="left"/>
+            </w:pPr>
+            <w:r>
+              <w:rPr>
+                <w:rFonts w:ascii="Calibri" w:hAnsi="Calibri"/>
+                <w:b w:val="0"/>
+                <w:color w:val="111827"/>
+                <w:sz w:val="17"/>
+              </w:rPr>
+              <w:t>Snapshots shall use canonical member ordering and SHA-256 content identity.</w:t>
+            </w:r>
+          </w:p>
+        </w:tc>
+        <w:tc>
+          <w:tcPr>
+            <w:tcW w:type="dxa" w:w="3260"/>
+            <w:tcMar>
+              <w:top w:w="80" w:type="dxa"/>
+              <w:start w:w="120" w:type="dxa"/>
+              <w:bottom w:w="80" w:type="dxa"/>
+              <w:end w:w="120" w:type="dxa"/>
+            </w:tcMar>
+            <w:vAlign w:val="center"/>
+            <w:shd w:fill="FFFFFF"/>
+          </w:tcPr>
+          <w:p>
+            <w:pPr>
+              <w:spacing w:before="0" w:after="40" w:line="252" w:lineRule="auto"/>
+              <w:jc w:val="left"/>
+            </w:pPr>
+            <w:r>
+              <w:rPr>
+                <w:rFonts w:ascii="Calibri" w:hAnsi="Calibri"/>
+                <w:b w:val="0"/>
+                <w:color w:val="111827"/>
+                <w:sz w:val="17"/>
+              </w:rPr>
+              <w:t>Canonical snapshot test</w:t>
+            </w:r>
+          </w:p>
+        </w:tc>
+      </w:tr>
+      <w:tr>
+        <w:trPr>
+          <w:cantSplit/>
+        </w:trPr>
+        <w:tc>
+          <w:tcPr>
+            <w:tcW w:type="dxa" w:w="1650"/>
+            <w:tcMar>
+              <w:top w:w="80" w:type="dxa"/>
+              <w:start w:w="120" w:type="dxa"/>
+              <w:bottom w:w="80" w:type="dxa"/>
+              <w:end w:w="120" w:type="dxa"/>
+            </w:tcMar>
+            <w:vAlign w:val="center"/>
+            <w:shd w:fill="FFFFFF"/>
+          </w:tcPr>
+          <w:p>
+            <w:pPr>
+              <w:spacing w:before="0" w:after="40" w:line="252" w:lineRule="auto"/>
+              <w:jc w:val="center"/>
+            </w:pPr>
+            <w:r>
+              <w:rPr>
+                <w:rFonts w:ascii="Calibri" w:hAnsi="Calibri"/>
+                <w:b w:val="0"/>
+                <w:color w:val="111827"/>
+                <w:sz w:val="17"/>
+              </w:rPr>
+              <w:t>DV-F-021</w:t>
+            </w:r>
+          </w:p>
+        </w:tc>
+        <w:tc>
+          <w:tcPr>
+            <w:tcW w:type="dxa" w:w="4450"/>
+            <w:tcMar>
+              <w:top w:w="80" w:type="dxa"/>
+              <w:start w:w="120" w:type="dxa"/>
+              <w:bottom w:w="80" w:type="dxa"/>
+              <w:end w:w="120" w:type="dxa"/>
+            </w:tcMar>
+            <w:vAlign w:val="center"/>
+            <w:shd w:fill="FFFFFF"/>
+          </w:tcPr>
+          <w:p>
+            <w:pPr>
+              <w:spacing w:before="0" w:after="40" w:line="252" w:lineRule="auto"/>
+              <w:jc w:val="left"/>
+            </w:pPr>
+            <w:r>
+              <w:rPr>
+                <w:rFonts w:ascii="Calibri" w:hAnsi="Calibri"/>
+                <w:b w:val="0"/>
+                <w:color w:val="111827"/>
+                <w:sz w:val="17"/>
+              </w:rPr>
+              <w:t>Restore shall isolate member state, restore logical time, and increment versions.</w:t>
+            </w:r>
+          </w:p>
+        </w:tc>
+        <w:tc>
+          <w:tcPr>
+            <w:tcW w:type="dxa" w:w="3260"/>
+            <w:tcMar>
+              <w:top w:w="80" w:type="dxa"/>
+              <w:start w:w="120" w:type="dxa"/>
+              <w:bottom w:w="80" w:type="dxa"/>
+              <w:end w:w="120" w:type="dxa"/>
+            </w:tcMar>
+            <w:vAlign w:val="center"/>
+            <w:shd w:fill="FFFFFF"/>
+          </w:tcPr>
+          <w:p>
+            <w:pPr>
+              <w:spacing w:before="0" w:after="40" w:line="252" w:lineRule="auto"/>
+              <w:jc w:val="left"/>
+            </w:pPr>
+            <w:r>
+              <w:rPr>
+                <w:rFonts w:ascii="Calibri" w:hAnsi="Calibri"/>
+                <w:b w:val="0"/>
+                <w:color w:val="111827"/>
+                <w:sz w:val="17"/>
+              </w:rPr>
+              <w:t>Isolation and restore test</w:t>
+            </w:r>
+          </w:p>
+        </w:tc>
+      </w:tr>
     </w:tbl>
     <w:p>
       <w:pPr>
@@ -6847,6 +7617,95 @@
                 <w:sz w:val="17"/>
               </w:rPr>
               <w:t>Conservation assertions</w:t>
+            </w:r>
+          </w:p>
+        </w:tc>
+      </w:tr>
+      <w:tr>
+        <w:trPr>
+          <w:cantSplit/>
+        </w:trPr>
+        <w:tc>
+          <w:tcPr>
+            <w:tcW w:type="dxa" w:w="1650"/>
+            <w:tcMar>
+              <w:top w:w="80" w:type="dxa"/>
+              <w:start w:w="120" w:type="dxa"/>
+              <w:bottom w:w="80" w:type="dxa"/>
+              <w:end w:w="120" w:type="dxa"/>
+            </w:tcMar>
+            <w:vAlign w:val="center"/>
+            <w:shd w:fill="FFFFFF"/>
+          </w:tcPr>
+          <w:p>
+            <w:pPr>
+              <w:spacing w:before="0" w:after="40" w:line="252" w:lineRule="auto"/>
+              <w:jc w:val="center"/>
+            </w:pPr>
+            <w:r>
+              <w:rPr>
+                <w:rFonts w:ascii="Calibri" w:hAnsi="Calibri"/>
+                <w:b w:val="0"/>
+                <w:color w:val="111827"/>
+                <w:sz w:val="17"/>
+              </w:rPr>
+              <w:t>DV-NF-010</w:t>
+            </w:r>
+          </w:p>
+        </w:tc>
+        <w:tc>
+          <w:tcPr>
+            <w:tcW w:type="dxa" w:w="4450"/>
+            <w:tcMar>
+              <w:top w:w="80" w:type="dxa"/>
+              <w:start w:w="120" w:type="dxa"/>
+              <w:bottom w:w="80" w:type="dxa"/>
+              <w:end w:w="120" w:type="dxa"/>
+            </w:tcMar>
+            <w:vAlign w:val="center"/>
+            <w:shd w:fill="FFFFFF"/>
+          </w:tcPr>
+          <w:p>
+            <w:pPr>
+              <w:spacing w:before="0" w:after="40" w:line="252" w:lineRule="auto"/>
+              <w:jc w:val="left"/>
+            </w:pPr>
+            <w:r>
+              <w:rPr>
+                <w:rFonts w:ascii="Calibri" w:hAnsi="Calibri"/>
+                <w:b w:val="0"/>
+                <w:color w:val="111827"/>
+                <w:sz w:val="17"/>
+              </w:rPr>
+              <w:t>Session mutations shall emit atomic bounded evidence without background loops.</w:t>
+            </w:r>
+          </w:p>
+        </w:tc>
+        <w:tc>
+          <w:tcPr>
+            <w:tcW w:type="dxa" w:w="3260"/>
+            <w:tcMar>
+              <w:top w:w="80" w:type="dxa"/>
+              <w:start w:w="120" w:type="dxa"/>
+              <w:bottom w:w="80" w:type="dxa"/>
+              <w:end w:w="120" w:type="dxa"/>
+            </w:tcMar>
+            <w:vAlign w:val="center"/>
+            <w:shd w:fill="FFFFFF"/>
+          </w:tcPr>
+          <w:p>
+            <w:pPr>
+              <w:spacing w:before="0" w:after="40" w:line="252" w:lineRule="auto"/>
+              <w:jc w:val="left"/>
+            </w:pPr>
+            <w:r>
+              <w:rPr>
+                <w:rFonts w:ascii="Calibri" w:hAnsi="Calibri"/>
+                <w:b w:val="0"/>
+                <w:color w:val="111827"/>
+                <w:sz w:val="17"/>
+              </w:rPr>
+              <w:t>Transaction assertions</w:t>
             </w:r>
           </w:p>
         </w:tc>
@@ -7093,6 +7952,54 @@
     </w:p>
     <w:p>
       <w:pPr>
+        <w:pStyle w:val="Heading2"/>
+        <w:keepNext/>
+        <w:keepLines/>
+      </w:pPr>
+      <w:r>
+        <w:t>ADR-DV-005 — Identify Snapshots by Canonical Content</w:t>
+      </w:r>
+    </w:p>
+    <w:p>
+      <w:r>
+        <w:rPr>
+          <w:rFonts w:ascii="Calibri" w:hAnsi="Calibri"/>
+          <w:b/>
+          <w:color w:val="111827"/>
+          <w:sz w:val="22"/>
+        </w:rPr>
+        <w:t>Decision.</w:t>
+      </w:r>
+      <w:r>
+        <w:rPr>
+          <w:rFonts w:ascii="Calibri" w:hAnsi="Calibri"/>
+          <w:color w:val="111827"/>
+          <w:sz w:val="22"/>
+        </w:rPr>
+        <w:t xml:space="preserve"> Sort snapshot members by vehicle identifier, serialize compact JSON with sorted keys, and record a SHA-256 digest. Restore maps states by identifier and locks members in deterministic order.</w:t>
+      </w:r>
+    </w:p>
+    <w:p>
+      <w:r>
+        <w:rPr>
+          <w:rFonts w:ascii="Calibri" w:hAnsi="Calibri"/>
+          <w:b/>
+          <w:color w:val="111827"/>
+          <w:sz w:val="22"/>
+        </w:rPr>
+        <w:t>Rationale.</w:t>
+      </w:r>
+      <w:r>
+        <w:rPr>
+          <w:rFonts w:ascii="Calibri" w:hAnsi="Calibri"/>
+          <w:color w:val="111827"/>
+          <w:sz w:val="22"/>
+        </w:rPr>
+        <w:t xml:space="preserve"> Database return order must not influence evidence identity. Explicit identifier mapping prevents cross-vehicle state contamination and supports reproducible replay comparisons.</w:t>
+      </w:r>
+    </w:p>
+    <w:p>
+      <w:pPr>
         <w:pStyle w:val="Heading1"/>
         <w:keepNext/>
         <w:keepLines/>
@@ -9522,6 +10429,540 @@
                 <w:sz w:val="17"/>
               </w:rPr>
               <w:t>Existing states receive the safe suspension baseline and schema reaches head</w:t>
+            </w:r>
+          </w:p>
+        </w:tc>
+      </w:tr>
+      <w:tr>
+        <w:trPr>
+          <w:cantSplit/>
+        </w:trPr>
+        <w:tc>
+          <w:tcPr>
+            <w:tcW w:type="dxa" w:w="1650"/>
+            <w:tcMar>
+              <w:top w:w="80" w:type="dxa"/>
+              <w:start w:w="120" w:type="dxa"/>
+              <w:bottom w:w="80" w:type="dxa"/>
+              <w:end w:w="120" w:type="dxa"/>
+            </w:tcMar>
+            <w:vAlign w:val="center"/>
+            <w:shd w:fill="FFFFFF"/>
+          </w:tcPr>
+          <w:p>
+            <w:pPr>
+              <w:spacing w:before="0" w:after="40" w:line="252" w:lineRule="auto"/>
+              <w:jc w:val="center"/>
+            </w:pPr>
+            <w:r>
+              <w:rPr>
+                <w:rFonts w:ascii="Calibri" w:hAnsi="Calibri"/>
+                <w:b w:val="0"/>
+                <w:color w:val="111827"/>
+                <w:sz w:val="17"/>
+              </w:rPr>
+              <w:t>DV-T-027</w:t>
+            </w:r>
+          </w:p>
+        </w:tc>
+        <w:tc>
+          <w:tcPr>
+            <w:tcW w:type="dxa" w:w="4450"/>
+            <w:tcMar>
+              <w:top w:w="80" w:type="dxa"/>
+              <w:start w:w="120" w:type="dxa"/>
+              <w:bottom w:w="80" w:type="dxa"/>
+              <w:end w:w="120" w:type="dxa"/>
+            </w:tcMar>
+            <w:vAlign w:val="center"/>
+            <w:shd w:fill="FFFFFF"/>
+          </w:tcPr>
+          <w:p>
+            <w:pPr>
+              <w:spacing w:before="0" w:after="40" w:line="252" w:lineRule="auto"/>
+              <w:jc w:val="left"/>
+            </w:pPr>
+            <w:r>
+              <w:rPr>
+                <w:rFonts w:ascii="Calibri" w:hAnsi="Calibri"/>
+                <w:b w:val="0"/>
+                <w:color w:val="111827"/>
+                <w:sz w:val="17"/>
+              </w:rPr>
+              <w:t>Create sessions at minimum/maximum size</w:t>
+            </w:r>
+          </w:p>
+        </w:tc>
+        <w:tc>
+          <w:tcPr>
+            <w:tcW w:type="dxa" w:w="3260"/>
+            <w:tcMar>
+              <w:top w:w="80" w:type="dxa"/>
+              <w:start w:w="120" w:type="dxa"/>
+              <w:bottom w:w="80" w:type="dxa"/>
+              <w:end w:w="120" w:type="dxa"/>
+            </w:tcMar>
+            <w:vAlign w:val="center"/>
+            <w:shd w:fill="FFFFFF"/>
+          </w:tcPr>
+          <w:p>
+            <w:pPr>
+              <w:spacing w:before="0" w:after="40" w:line="252" w:lineRule="auto"/>
+              <w:jc w:val="left"/>
+            </w:pPr>
+            <w:r>
+              <w:rPr>
+                <w:rFonts w:ascii="Calibri" w:hAnsi="Calibri"/>
+                <w:b w:val="0"/>
+                <w:color w:val="111827"/>
+                <w:sz w:val="17"/>
+              </w:rPr>
+              <w:t>Accept 1-20 unique vehicles and reject duplicates or overflow</w:t>
+            </w:r>
+          </w:p>
+        </w:tc>
+      </w:tr>
+      <w:tr>
+        <w:trPr>
+          <w:cantSplit/>
+        </w:trPr>
+        <w:tc>
+          <w:tcPr>
+            <w:tcW w:type="dxa" w:w="1650"/>
+            <w:tcMar>
+              <w:top w:w="80" w:type="dxa"/>
+              <w:start w:w="120" w:type="dxa"/>
+              <w:bottom w:w="80" w:type="dxa"/>
+              <w:end w:w="120" w:type="dxa"/>
+            </w:tcMar>
+            <w:vAlign w:val="center"/>
+            <w:shd w:fill="FFFFFF"/>
+          </w:tcPr>
+          <w:p>
+            <w:pPr>
+              <w:spacing w:before="0" w:after="40" w:line="252" w:lineRule="auto"/>
+              <w:jc w:val="center"/>
+            </w:pPr>
+            <w:r>
+              <w:rPr>
+                <w:rFonts w:ascii="Calibri" w:hAnsi="Calibri"/>
+                <w:b w:val="0"/>
+                <w:color w:val="111827"/>
+                <w:sz w:val="17"/>
+              </w:rPr>
+              <w:t>DV-T-028</w:t>
+            </w:r>
+          </w:p>
+        </w:tc>
+        <w:tc>
+          <w:tcPr>
+            <w:tcW w:type="dxa" w:w="4450"/>
+            <w:tcMar>
+              <w:top w:w="80" w:type="dxa"/>
+              <w:start w:w="120" w:type="dxa"/>
+              <w:bottom w:w="80" w:type="dxa"/>
+              <w:end w:w="120" w:type="dxa"/>
+            </w:tcMar>
+            <w:vAlign w:val="center"/>
+            <w:shd w:fill="FFFFFF"/>
+          </w:tcPr>
+          <w:p>
+            <w:pPr>
+              <w:spacing w:before="0" w:after="40" w:line="252" w:lineRule="auto"/>
+              <w:jc w:val="left"/>
+            </w:pPr>
+            <w:r>
+              <w:rPr>
+                <w:rFonts w:ascii="Calibri" w:hAnsi="Calibri"/>
+                <w:b w:val="0"/>
+                <w:color w:val="111827"/>
+                <w:sz w:val="17"/>
+              </w:rPr>
+              <w:t>Capture identical member states</w:t>
+            </w:r>
+          </w:p>
+        </w:tc>
+        <w:tc>
+          <w:tcPr>
+            <w:tcW w:type="dxa" w:w="3260"/>
+            <w:tcMar>
+              <w:top w:w="80" w:type="dxa"/>
+              <w:start w:w="120" w:type="dxa"/>
+              <w:bottom w:w="80" w:type="dxa"/>
+              <w:end w:w="120" w:type="dxa"/>
+            </w:tcMar>
+            <w:vAlign w:val="center"/>
+            <w:shd w:fill="FFFFFF"/>
+          </w:tcPr>
+          <w:p>
+            <w:pPr>
+              <w:spacing w:before="0" w:after="40" w:line="252" w:lineRule="auto"/>
+              <w:jc w:val="left"/>
+            </w:pPr>
+            <w:r>
+              <w:rPr>
+                <w:rFonts w:ascii="Calibri" w:hAnsi="Calibri"/>
+                <w:b w:val="0"/>
+                <w:color w:val="111827"/>
+                <w:sz w:val="17"/>
+              </w:rPr>
+              <w:t>Canonical state ordering and SHA-256 identity are repeatable</w:t>
+            </w:r>
+          </w:p>
+        </w:tc>
+      </w:tr>
+      <w:tr>
+        <w:trPr>
+          <w:cantSplit/>
+        </w:trPr>
+        <w:tc>
+          <w:tcPr>
+            <w:tcW w:type="dxa" w:w="1650"/>
+            <w:tcMar>
+              <w:top w:w="80" w:type="dxa"/>
+              <w:start w:w="120" w:type="dxa"/>
+              <w:bottom w:w="80" w:type="dxa"/>
+              <w:end w:w="120" w:type="dxa"/>
+            </w:tcMar>
+            <w:vAlign w:val="center"/>
+            <w:shd w:fill="FFFFFF"/>
+          </w:tcPr>
+          <w:p>
+            <w:pPr>
+              <w:spacing w:before="0" w:after="40" w:line="252" w:lineRule="auto"/>
+              <w:jc w:val="center"/>
+            </w:pPr>
+            <w:r>
+              <w:rPr>
+                <w:rFonts w:ascii="Calibri" w:hAnsi="Calibri"/>
+                <w:b w:val="0"/>
+                <w:color w:val="111827"/>
+                <w:sz w:val="17"/>
+              </w:rPr>
+              <w:t>DV-T-029</w:t>
+            </w:r>
+          </w:p>
+        </w:tc>
+        <w:tc>
+          <w:tcPr>
+            <w:tcW w:type="dxa" w:w="4450"/>
+            <w:tcMar>
+              <w:top w:w="80" w:type="dxa"/>
+              <w:start w:w="120" w:type="dxa"/>
+              <w:bottom w:w="80" w:type="dxa"/>
+              <w:end w:w="120" w:type="dxa"/>
+            </w:tcMar>
+            <w:vAlign w:val="center"/>
+            <w:shd w:fill="FFFFFF"/>
+          </w:tcPr>
+          <w:p>
+            <w:pPr>
+              <w:spacing w:before="0" w:after="40" w:line="252" w:lineRule="auto"/>
+              <w:jc w:val="left"/>
+            </w:pPr>
+            <w:r>
+              <w:rPr>
+                <w:rFonts w:ascii="Calibri" w:hAnsi="Calibri"/>
+                <w:b w:val="0"/>
+                <w:color w:val="111827"/>
+                <w:sz w:val="17"/>
+              </w:rPr>
+              <w:t>Mutate two members and restore</w:t>
+            </w:r>
+          </w:p>
+        </w:tc>
+        <w:tc>
+          <w:tcPr>
+            <w:tcW w:type="dxa" w:w="3260"/>
+            <w:tcMar>
+              <w:top w:w="80" w:type="dxa"/>
+              <w:start w:w="120" w:type="dxa"/>
+              <w:bottom w:w="80" w:type="dxa"/>
+              <w:end w:w="120" w:type="dxa"/>
+            </w:tcMar>
+            <w:vAlign w:val="center"/>
+            <w:shd w:fill="FFFFFF"/>
+          </w:tcPr>
+          <w:p>
+            <w:pPr>
+              <w:spacing w:before="0" w:after="40" w:line="252" w:lineRule="auto"/>
+              <w:jc w:val="left"/>
+            </w:pPr>
+            <w:r>
+              <w:rPr>
+                <w:rFonts w:ascii="Calibri" w:hAnsi="Calibri"/>
+                <w:b w:val="0"/>
+                <w:color w:val="111827"/>
+                <w:sz w:val="17"/>
+              </w:rPr>
+              <w:t>Each vehicle receives only its own saved state and logical time</w:t>
+            </w:r>
+          </w:p>
+        </w:tc>
+      </w:tr>
+      <w:tr>
+        <w:trPr>
+          <w:cantSplit/>
+        </w:trPr>
+        <w:tc>
+          <w:tcPr>
+            <w:tcW w:type="dxa" w:w="1650"/>
+            <w:tcMar>
+              <w:top w:w="80" w:type="dxa"/>
+              <w:start w:w="120" w:type="dxa"/>
+              <w:bottom w:w="80" w:type="dxa"/>
+              <w:end w:w="120" w:type="dxa"/>
+            </w:tcMar>
+            <w:vAlign w:val="center"/>
+            <w:shd w:fill="FFFFFF"/>
+          </w:tcPr>
+          <w:p>
+            <w:pPr>
+              <w:spacing w:before="0" w:after="40" w:line="252" w:lineRule="auto"/>
+              <w:jc w:val="center"/>
+            </w:pPr>
+            <w:r>
+              <w:rPr>
+                <w:rFonts w:ascii="Calibri" w:hAnsi="Calibri"/>
+                <w:b w:val="0"/>
+                <w:color w:val="111827"/>
+                <w:sz w:val="17"/>
+              </w:rPr>
+              <w:t>DV-T-030</w:t>
+            </w:r>
+          </w:p>
+        </w:tc>
+        <w:tc>
+          <w:tcPr>
+            <w:tcW w:type="dxa" w:w="4450"/>
+            <w:tcMar>
+              <w:top w:w="80" w:type="dxa"/>
+              <w:start w:w="120" w:type="dxa"/>
+              <w:bottom w:w="80" w:type="dxa"/>
+              <w:end w:w="120" w:type="dxa"/>
+            </w:tcMar>
+            <w:vAlign w:val="center"/>
+            <w:shd w:fill="FFFFFF"/>
+          </w:tcPr>
+          <w:p>
+            <w:pPr>
+              <w:spacing w:before="0" w:after="40" w:line="252" w:lineRule="auto"/>
+              <w:jc w:val="left"/>
+            </w:pPr>
+            <w:r>
+              <w:rPr>
+                <w:rFonts w:ascii="Calibri" w:hAnsi="Calibri"/>
+                <w:b w:val="0"/>
+                <w:color w:val="111827"/>
+                <w:sz w:val="17"/>
+              </w:rPr>
+              <w:t>Inspect restore versions</w:t>
+            </w:r>
+          </w:p>
+        </w:tc>
+        <w:tc>
+          <w:tcPr>
+            <w:tcW w:type="dxa" w:w="3260"/>
+            <w:tcMar>
+              <w:top w:w="80" w:type="dxa"/>
+              <w:start w:w="120" w:type="dxa"/>
+              <w:bottom w:w="80" w:type="dxa"/>
+              <w:end w:w="120" w:type="dxa"/>
+            </w:tcMar>
+            <w:vAlign w:val="center"/>
+            <w:shd w:fill="FFFFFF"/>
+          </w:tcPr>
+          <w:p>
+            <w:pPr>
+              <w:spacing w:before="0" w:after="40" w:line="252" w:lineRule="auto"/>
+              <w:jc w:val="left"/>
+            </w:pPr>
+            <w:r>
+              <w:rPr>
+                <w:rFonts w:ascii="Calibri" w:hAnsi="Calibri"/>
+                <w:b w:val="0"/>
+                <w:color w:val="111827"/>
+                <w:sz w:val="17"/>
+              </w:rPr>
+              <w:t>Every restored aggregate increments exactly once</w:t>
+            </w:r>
+          </w:p>
+        </w:tc>
+      </w:tr>
+      <w:tr>
+        <w:trPr>
+          <w:cantSplit/>
+        </w:trPr>
+        <w:tc>
+          <w:tcPr>
+            <w:tcW w:type="dxa" w:w="1650"/>
+            <w:tcMar>
+              <w:top w:w="80" w:type="dxa"/>
+              <w:start w:w="120" w:type="dxa"/>
+              <w:bottom w:w="80" w:type="dxa"/>
+              <w:end w:w="120" w:type="dxa"/>
+            </w:tcMar>
+            <w:vAlign w:val="center"/>
+            <w:shd w:fill="FFFFFF"/>
+          </w:tcPr>
+          <w:p>
+            <w:pPr>
+              <w:spacing w:before="0" w:after="40" w:line="252" w:lineRule="auto"/>
+              <w:jc w:val="center"/>
+            </w:pPr>
+            <w:r>
+              <w:rPr>
+                <w:rFonts w:ascii="Calibri" w:hAnsi="Calibri"/>
+                <w:b w:val="0"/>
+                <w:color w:val="111827"/>
+                <w:sz w:val="17"/>
+              </w:rPr>
+              <w:t>DV-T-031</w:t>
+            </w:r>
+          </w:p>
+        </w:tc>
+        <w:tc>
+          <w:tcPr>
+            <w:tcW w:type="dxa" w:w="4450"/>
+            <w:tcMar>
+              <w:top w:w="80" w:type="dxa"/>
+              <w:start w:w="120" w:type="dxa"/>
+              <w:bottom w:w="80" w:type="dxa"/>
+              <w:end w:w="120" w:type="dxa"/>
+            </w:tcMar>
+            <w:vAlign w:val="center"/>
+            <w:shd w:fill="FFFFFF"/>
+          </w:tcPr>
+          <w:p>
+            <w:pPr>
+              <w:spacing w:before="0" w:after="40" w:line="252" w:lineRule="auto"/>
+              <w:jc w:val="left"/>
+            </w:pPr>
+            <w:r>
+              <w:rPr>
+                <w:rFonts w:ascii="Calibri" w:hAnsi="Calibri"/>
+                <w:b w:val="0"/>
+                <w:color w:val="111827"/>
+                <w:sz w:val="17"/>
+              </w:rPr>
+              <w:t>Inspect session mutations</w:t>
+            </w:r>
+          </w:p>
+        </w:tc>
+        <w:tc>
+          <w:tcPr>
+            <w:tcW w:type="dxa" w:w="3260"/>
+            <w:tcMar>
+              <w:top w:w="80" w:type="dxa"/>
+              <w:start w:w="120" w:type="dxa"/>
+              <w:bottom w:w="80" w:type="dxa"/>
+              <w:end w:w="120" w:type="dxa"/>
+            </w:tcMar>
+            <w:vAlign w:val="center"/>
+            <w:shd w:fill="FFFFFF"/>
+          </w:tcPr>
+          <w:p>
+            <w:pPr>
+              <w:spacing w:before="0" w:after="40" w:line="252" w:lineRule="auto"/>
+              <w:jc w:val="left"/>
+            </w:pPr>
+            <w:r>
+              <w:rPr>
+                <w:rFonts w:ascii="Calibri" w:hAnsi="Calibri"/>
+                <w:b w:val="0"/>
+                <w:color w:val="111827"/>
+                <w:sz w:val="17"/>
+              </w:rPr>
+              <w:t>Session, snapshot, restore, audit, and outbox evidence commit atomically</w:t>
+            </w:r>
+          </w:p>
+        </w:tc>
+      </w:tr>
+      <w:tr>
+        <w:trPr>
+          <w:cantSplit/>
+        </w:trPr>
+        <w:tc>
+          <w:tcPr>
+            <w:tcW w:type="dxa" w:w="1650"/>
+            <w:tcMar>
+              <w:top w:w="80" w:type="dxa"/>
+              <w:start w:w="120" w:type="dxa"/>
+              <w:bottom w:w="80" w:type="dxa"/>
+              <w:end w:w="120" w:type="dxa"/>
+            </w:tcMar>
+            <w:vAlign w:val="center"/>
+            <w:shd w:fill="FFFFFF"/>
+          </w:tcPr>
+          <w:p>
+            <w:pPr>
+              <w:spacing w:before="0" w:after="40" w:line="252" w:lineRule="auto"/>
+              <w:jc w:val="center"/>
+            </w:pPr>
+            <w:r>
+              <w:rPr>
+                <w:rFonts w:ascii="Calibri" w:hAnsi="Calibri"/>
+                <w:b w:val="0"/>
+                <w:color w:val="111827"/>
+                <w:sz w:val="17"/>
+              </w:rPr>
+              <w:t>DV-T-032</w:t>
+            </w:r>
+          </w:p>
+        </w:tc>
+        <w:tc>
+          <w:tcPr>
+            <w:tcW w:type="dxa" w:w="4450"/>
+            <w:tcMar>
+              <w:top w:w="80" w:type="dxa"/>
+              <w:start w:w="120" w:type="dxa"/>
+              <w:bottom w:w="80" w:type="dxa"/>
+              <w:end w:w="120" w:type="dxa"/>
+            </w:tcMar>
+            <w:vAlign w:val="center"/>
+            <w:shd w:fill="FFFFFF"/>
+          </w:tcPr>
+          <w:p>
+            <w:pPr>
+              <w:spacing w:before="0" w:after="40" w:line="252" w:lineRule="auto"/>
+              <w:jc w:val="left"/>
+            </w:pPr>
+            <w:r>
+              <w:rPr>
+                <w:rFonts w:ascii="Calibri" w:hAnsi="Calibri"/>
+                <w:b w:val="0"/>
+                <w:color w:val="111827"/>
+                <w:sz w:val="17"/>
+              </w:rPr>
+              <w:t>Apply migration 0017</w:t>
+            </w:r>
+          </w:p>
+        </w:tc>
+        <w:tc>
+          <w:tcPr>
+            <w:tcW w:type="dxa" w:w="3260"/>
+            <w:tcMar>
+              <w:top w:w="80" w:type="dxa"/>
+              <w:start w:w="120" w:type="dxa"/>
+              <w:bottom w:w="80" w:type="dxa"/>
+              <w:end w:w="120" w:type="dxa"/>
+            </w:tcMar>
+            <w:vAlign w:val="center"/>
+            <w:shd w:fill="FFFFFF"/>
+          </w:tcPr>
+          <w:p>
+            <w:pPr>
+              <w:spacing w:before="0" w:after="40" w:line="252" w:lineRule="auto"/>
+              <w:jc w:val="left"/>
+            </w:pPr>
+            <w:r>
+              <w:rPr>
+                <w:rFonts w:ascii="Calibri" w:hAnsi="Calibri"/>
+                <w:b w:val="0"/>
+                <w:color w:val="111827"/>
+                <w:sz w:val="17"/>
+              </w:rPr>
+              <w:t>Session/member/snapshot tables reach the expected schema head</w:t>
             </w:r>
           </w:p>
         </w:tc>
@@ -10630,7 +12071,7 @@
                 <w:color w:val="111827"/>
                 <w:sz w:val="17"/>
               </w:rPr>
-              <w:t>No multi-vehicle session abstraction</w:t>
+              <w:t>Session membership is immutable after creation</w:t>
             </w:r>
           </w:p>
         </w:tc>
@@ -10658,7 +12099,7 @@
                 <w:color w:val="111827"/>
                 <w:sz w:val="17"/>
               </w:rPr>
-              <w:t>Reproducibility exists per vehicle but not across coordinated fleets</w:t>
+              <w:t>Complex fleet reconfiguration requires a new session</w:t>
             </w:r>
           </w:p>
         </w:tc>
@@ -10686,7 +12127,7 @@
                 <w:color w:val="111827"/>
                 <w:sz w:val="17"/>
               </w:rPr>
-              <w:t>Add isolated sessions and snapshots in II-5</w:t>
+              <w:t>Add explicit versioned composition changes only when scenarios require them</w:t>
             </w:r>
           </w:p>
         </w:tc>
@@ -11347,7 +12788,7 @@
                 <w:color w:val="111827"/>
                 <w:sz w:val="17"/>
               </w:rPr>
-              <w:t>Planned next</w:t>
+              <w:t>Implemented</w:t>
             </w:r>
           </w:p>
         </w:tc>
@@ -11436,7 +12877,7 @@
                 <w:color w:val="111827"/>
                 <w:sz w:val="17"/>
               </w:rPr>
-              <w:t>Planned</w:t>
+              <w:t>Planned next</w:t>
             </w:r>
           </w:p>
         </w:tc>
@@ -11588,7 +13029,7 @@
         <w:color w:val="667085"/>
         <w:sz w:val="17"/>
       </w:rPr>
-      <w:t>ATEP Volume II Workbook  |  Version 0.4.0</w:t>
+      <w:t>ATEP Volume II Workbook  |  Version 0.5.0</w:t>
     </w:r>
     <w:r>
       <w:rPr>

</xml_diff>

<commit_message>
Add versioned AAOS VHAL mapping contract
</commit_message>
<xml_diff>
--- a/docs/ATEP_Volume_II_Digital_Vehicle_Engineering_Workbook.docx
+++ b/docs/ATEP_Volume_II_Digital_Vehicle_Engineering_Workbook.docx
@@ -143,7 +143,7 @@
                 <w:color w:val="0B2545"/>
                 <w:sz w:val="19"/>
               </w:rPr>
-              <w:t>0.5.0</w:t>
+              <w:t>0.6.0</w:t>
             </w:r>
           </w:p>
         </w:tc>
@@ -265,7 +265,7 @@
                 <w:color w:val="111827"/>
                 <w:sz w:val="19"/>
               </w:rPr>
-              <w:t>Living document - Increments II-1 through II-5 implemented</w:t>
+              <w:t>Living document - Increments II-1 through II-6 implemented</w:t>
             </w:r>
           </w:p>
         </w:tc>
@@ -1850,6 +1850,123 @@
           </w:p>
         </w:tc>
       </w:tr>
+      <w:tr>
+        <w:trPr>
+          <w:cantSplit/>
+        </w:trPr>
+        <w:tc>
+          <w:tcPr>
+            <w:tcW w:type="dxa" w:w="1150"/>
+            <w:tcMar>
+              <w:top w:w="80" w:type="dxa"/>
+              <w:start w:w="120" w:type="dxa"/>
+              <w:bottom w:w="80" w:type="dxa"/>
+              <w:end w:w="120" w:type="dxa"/>
+            </w:tcMar>
+            <w:vAlign w:val="center"/>
+            <w:shd w:fill="FFFFFF"/>
+          </w:tcPr>
+          <w:p>
+            <w:pPr>
+              <w:spacing w:before="0" w:after="40" w:line="252" w:lineRule="auto"/>
+              <w:jc w:val="center"/>
+            </w:pPr>
+            <w:r>
+              <w:rPr>
+                <w:rFonts w:ascii="Calibri" w:hAnsi="Calibri"/>
+                <w:b w:val="0"/>
+                <w:color w:val="111827"/>
+                <w:sz w:val="16"/>
+              </w:rPr>
+              <w:t>0.6.0</w:t>
+            </w:r>
+          </w:p>
+        </w:tc>
+        <w:tc>
+          <w:tcPr>
+            <w:tcW w:type="dxa" w:w="1400"/>
+            <w:tcMar>
+              <w:top w:w="80" w:type="dxa"/>
+              <w:start w:w="120" w:type="dxa"/>
+              <w:bottom w:w="80" w:type="dxa"/>
+              <w:end w:w="120" w:type="dxa"/>
+            </w:tcMar>
+            <w:vAlign w:val="center"/>
+            <w:shd w:fill="FFFFFF"/>
+          </w:tcPr>
+          <w:p>
+            <w:pPr>
+              <w:spacing w:before="0" w:after="40" w:line="252" w:lineRule="auto"/>
+              <w:jc w:val="left"/>
+            </w:pPr>
+            <w:r>
+              <w:rPr>
+                <w:rFonts w:ascii="Calibri" w:hAnsi="Calibri"/>
+                <w:b w:val="0"/>
+                <w:color w:val="111827"/>
+                <w:sz w:val="16"/>
+              </w:rPr>
+              <w:t>24 August 2026</w:t>
+            </w:r>
+          </w:p>
+        </w:tc>
+        <w:tc>
+          <w:tcPr>
+            <w:tcW w:type="dxa" w:w="3450"/>
+            <w:tcMar>
+              <w:top w:w="80" w:type="dxa"/>
+              <w:start w:w="120" w:type="dxa"/>
+              <w:bottom w:w="80" w:type="dxa"/>
+              <w:end w:w="120" w:type="dxa"/>
+            </w:tcMar>
+            <w:vAlign w:val="center"/>
+            <w:shd w:fill="FFFFFF"/>
+          </w:tcPr>
+          <w:p>
+            <w:pPr>
+              <w:spacing w:before="0" w:after="40" w:line="252" w:lineRule="auto"/>
+              <w:jc w:val="left"/>
+            </w:pPr>
+            <w:r>
+              <w:rPr>
+                <w:rFonts w:ascii="Calibri" w:hAnsi="Calibri"/>
+                <w:b w:val="0"/>
+                <w:color w:val="111827"/>
+                <w:sz w:val="16"/>
+              </w:rPr>
+              <w:t>II-6: published the telemetry-authorized, versioned Android Automotive/VHAL mapping catalogue with explicit types, access, units, conversions, and global/seat/wheel area semantics</w:t>
+            </w:r>
+          </w:p>
+        </w:tc>
+        <w:tc>
+          <w:tcPr>
+            <w:tcW w:type="dxa" w:w="3360"/>
+            <w:tcMar>
+              <w:top w:w="80" w:type="dxa"/>
+              <w:start w:w="120" w:type="dxa"/>
+              <w:bottom w:w="80" w:type="dxa"/>
+              <w:end w:w="120" w:type="dxa"/>
+            </w:tcMar>
+            <w:vAlign w:val="center"/>
+            <w:shd w:fill="FFFFFF"/>
+          </w:tcPr>
+          <w:p>
+            <w:pPr>
+              <w:spacing w:before="0" w:after="40" w:line="252" w:lineRule="auto"/>
+              <w:jc w:val="left"/>
+            </w:pPr>
+            <w:r>
+              <w:rPr>
+                <w:rFonts w:ascii="Calibri" w:hAnsi="Calibri"/>
+                <w:b w:val="0"/>
+                <w:color w:val="111827"/>
+                <w:sz w:val="16"/>
+              </w:rPr>
+              <w:t>Implemented and verified by focused catalogue and OpenAPI tests, combined with the existing live CarSystemUI telemetry/command evidence</w:t>
+            </w:r>
+          </w:p>
+        </w:tc>
+      </w:tr>
     </w:tbl>
     <w:p>
       <w:pPr>
@@ -2026,7 +2143,7 @@
           <w:color w:val="111827"/>
           <w:sz w:val="22"/>
         </w:rPr>
-        <w:t>compatibility boundary for the future Android Automotive Vehicle Gateway.</w:t>
+        <w:t>a versioned Android Automotive/VHAL mapping catalogue for the Vehicle Gateway.</w:t>
       </w:r>
     </w:p>
     <w:p>
@@ -2121,7 +2238,7 @@
           <w:color w:val="111827"/>
           <w:sz w:val="22"/>
         </w:rPr>
-        <w:t>multi-vehicle sessions and distributed simulation scheduling;</w:t>
+        <w:t>distributed real-time simulation scheduling;</w:t>
       </w:r>
     </w:p>
     <w:p>
@@ -4330,6 +4447,104 @@
                 <w:sz w:val="17"/>
               </w:rPr>
               <w:t>Restore isolated member state and logical time</w:t>
+            </w:r>
+          </w:p>
+        </w:tc>
+      </w:tr>
+      <w:tr>
+        <w:trPr>
+          <w:cantSplit/>
+        </w:trPr>
+        <w:tc>
+          <w:tcPr>
+            <w:tcW w:type="dxa" w:w="1650"/>
+            <w:tcMar>
+              <w:top w:w="80" w:type="dxa"/>
+              <w:start w:w="120" w:type="dxa"/>
+              <w:bottom w:w="80" w:type="dxa"/>
+              <w:end w:w="120" w:type="dxa"/>
+            </w:tcMar>
+            <w:vAlign w:val="center"/>
+            <w:shd w:fill="FFFFFF"/>
+          </w:tcPr>
+          <w:p>
+            <w:pPr>
+              <w:spacing w:before="0" w:after="40" w:line="252" w:lineRule="auto"/>
+              <w:jc w:val="center"/>
+            </w:pPr>
+            <w:r>
+              <w:rPr>
+                <w:rFonts w:ascii="Calibri" w:hAnsi="Calibri"/>
+                <w:b w:val="0"/>
+                <w:color w:val="111827"/>
+                <w:sz w:val="17"/>
+              </w:rPr>
+              <w:t>GET /api/v1/vehicle-gateway/vhal-mappings</w:t>
+            </w:r>
+          </w:p>
+        </w:tc>
+        <w:tc>
+          <w:tcPr>
+            <w:tcW w:type="dxa" w:w="4450"/>
+            <w:tcMar>
+              <w:top w:w="80" w:type="dxa"/>
+              <w:start w:w="120" w:type="dxa"/>
+              <w:bottom w:w="80" w:type="dxa"/>
+              <w:end w:w="120" w:type="dxa"/>
+            </w:tcMar>
+            <w:vAlign w:val="center"/>
+            <w:shd w:fill="FFFFFF"/>
+          </w:tcPr>
+          <w:p>
+            <w:pPr>
+              <w:spacing w:before="0" w:after="40" w:line="252" w:lineRule="auto"/>
+              <w:jc w:val="left"/>
+            </w:pPr>
+            <w:r>
+              <w:rPr>
+                <w:rFonts w:ascii="Calibri" w:hAnsi="Calibri"/>
+                <w:b w:val="0"/>
+                <w:color w:val="111827"/>
+                <w:sz w:val="17"/>
+              </w:rPr>
+              <w:t xml:space="preserve">Gateway module with </w:t>
+            </w:r>
+            <w:r>
+              <w:rPr>
+                <w:rFonts w:ascii="Calibri" w:hAnsi="Calibri"/>
+                <w:b w:val="0"/>
+                <w:color w:val="111827"/>
+                <w:sz w:val="17"/>
+              </w:rPr>
+              <w:t>vehicle.telemetry.publish</w:t>
+            </w:r>
+          </w:p>
+        </w:tc>
+        <w:tc>
+          <w:tcPr>
+            <w:tcW w:type="dxa" w:w="3260"/>
+            <w:tcMar>
+              <w:top w:w="80" w:type="dxa"/>
+              <w:start w:w="120" w:type="dxa"/>
+              <w:bottom w:w="80" w:type="dxa"/>
+              <w:end w:w="120" w:type="dxa"/>
+            </w:tcMar>
+            <w:vAlign w:val="center"/>
+            <w:shd w:fill="FFFFFF"/>
+          </w:tcPr>
+          <w:p>
+            <w:pPr>
+              <w:spacing w:before="0" w:after="40" w:line="252" w:lineRule="auto"/>
+              <w:jc w:val="left"/>
+            </w:pPr>
+            <w:r>
+              <w:rPr>
+                <w:rFonts w:ascii="Calibri" w:hAnsi="Calibri"/>
+                <w:b w:val="0"/>
+                <w:color w:val="111827"/>
+                <w:sz w:val="17"/>
+              </w:rPr>
+              <w:t>Retrieve the reviewed versioned AAOS/VHAL mapping catalogue</w:t>
             </w:r>
           </w:p>
         </w:tc>
@@ -4550,6 +4765,68 @@
     </w:p>
     <w:p>
       <w:pPr>
+        <w:pStyle w:val="Heading2"/>
+        <w:keepNext/>
+        <w:keepLines/>
+      </w:pPr>
+      <w:r>
+        <w:t>6.6 Android Automotive/VHAL Mapping Contract</w:t>
+      </w:r>
+    </w:p>
+    <w:p>
+      <w:r>
+        <w:rPr>
+          <w:rFonts w:ascii="Calibri" w:hAnsi="Calibri"/>
+          <w:color w:val="111827"/>
+          <w:sz w:val="22"/>
+        </w:rPr>
+        <w:t xml:space="preserve">The II-6 catalogue maps symbolic Android </w:t>
+      </w:r>
+      <w:r>
+        <w:rPr>
+          <w:rFonts w:ascii="Consolas" w:hAnsi="Consolas"/>
+          <w:color w:val="1F4D78"/>
+          <w:sz w:val="19"/>
+        </w:rPr>
+        <w:t>VehiclePropertyIds</w:t>
+      </w:r>
+      <w:r>
+        <w:rPr>
+          <w:rFonts w:ascii="Calibri" w:hAnsi="Calibri"/>
+          <w:color w:val="111827"/>
+          <w:sz w:val="22"/>
+        </w:rPr>
+        <w:t xml:space="preserve"> names to canonical ATEP property names. It intentionally publishes symbols rather than copying Android integer constants: the CarSystemUI build resolves those constants from its selected Android SDK, while the backend contract remains stable and reviewable. Each entry declares value type, read/read-write access, global/seat/wheel area semantics, source and target units, and any required conversion.</w:t>
+      </w:r>
+    </w:p>
+    <w:p>
+      <w:r>
+        <w:rPr>
+          <w:rFonts w:ascii="Calibri" w:hAnsi="Calibri"/>
+          <w:color w:val="111827"/>
+          <w:sz w:val="22"/>
+        </w:rPr>
+        <w:t xml:space="preserve">The first catalogue covers speed, gear, ignition, EV battery energy/capacity, charging-port state, hybrid fuel level, zoned cabin temperature, and wheel-specific tyre pressure. Retrieval requires an authenticated module declaring </w:t>
+      </w:r>
+      <w:r>
+        <w:rPr>
+          <w:rFonts w:ascii="Consolas" w:hAnsi="Consolas"/>
+          <w:color w:val="1F4D78"/>
+          <w:sz w:val="19"/>
+        </w:rPr>
+        <w:t>vehicle.telemetry.publish</w:t>
+      </w:r>
+      <w:r>
+        <w:rPr>
+          <w:rFonts w:ascii="Calibri" w:hAnsi="Calibri"/>
+          <w:color w:val="111827"/>
+          <w:sz w:val="22"/>
+        </w:rPr>
+        <w:t>. The gateway still communicates only through the public ATEP API and receives no PostgreSQL, Redis, or RabbitMQ access.</w:t>
+      </w:r>
+    </w:p>
+    <w:p>
+      <w:pPr>
         <w:pStyle w:val="Heading1"/>
         <w:keepNext/>
         <w:keepLines/>
@@ -6693,6 +6970,184 @@
           </w:p>
         </w:tc>
       </w:tr>
+      <w:tr>
+        <w:trPr>
+          <w:cantSplit/>
+        </w:trPr>
+        <w:tc>
+          <w:tcPr>
+            <w:tcW w:type="dxa" w:w="1650"/>
+            <w:tcMar>
+              <w:top w:w="80" w:type="dxa"/>
+              <w:start w:w="120" w:type="dxa"/>
+              <w:bottom w:w="80" w:type="dxa"/>
+              <w:end w:w="120" w:type="dxa"/>
+            </w:tcMar>
+            <w:vAlign w:val="center"/>
+            <w:shd w:fill="FFFFFF"/>
+          </w:tcPr>
+          <w:p>
+            <w:pPr>
+              <w:spacing w:before="0" w:after="40" w:line="252" w:lineRule="auto"/>
+              <w:jc w:val="center"/>
+            </w:pPr>
+            <w:r>
+              <w:rPr>
+                <w:rFonts w:ascii="Calibri" w:hAnsi="Calibri"/>
+                <w:b w:val="0"/>
+                <w:color w:val="111827"/>
+                <w:sz w:val="17"/>
+              </w:rPr>
+              <w:t>DV-F-022</w:t>
+            </w:r>
+          </w:p>
+        </w:tc>
+        <w:tc>
+          <w:tcPr>
+            <w:tcW w:type="dxa" w:w="4450"/>
+            <w:tcMar>
+              <w:top w:w="80" w:type="dxa"/>
+              <w:start w:w="120" w:type="dxa"/>
+              <w:bottom w:w="80" w:type="dxa"/>
+              <w:end w:w="120" w:type="dxa"/>
+            </w:tcMar>
+            <w:vAlign w:val="center"/>
+            <w:shd w:fill="FFFFFF"/>
+          </w:tcPr>
+          <w:p>
+            <w:pPr>
+              <w:spacing w:before="0" w:after="40" w:line="252" w:lineRule="auto"/>
+              <w:jc w:val="left"/>
+            </w:pPr>
+            <w:r>
+              <w:rPr>
+                <w:rFonts w:ascii="Calibri" w:hAnsi="Calibri"/>
+                <w:b w:val="0"/>
+                <w:color w:val="111827"/>
+                <w:sz w:val="17"/>
+              </w:rPr>
+              <w:t>A telemetry-authorized gateway shall retrieve one versioned symbolic VHAL mapping catalogue.</w:t>
+            </w:r>
+          </w:p>
+        </w:tc>
+        <w:tc>
+          <w:tcPr>
+            <w:tcW w:type="dxa" w:w="3260"/>
+            <w:tcMar>
+              <w:top w:w="80" w:type="dxa"/>
+              <w:start w:w="120" w:type="dxa"/>
+              <w:bottom w:w="80" w:type="dxa"/>
+              <w:end w:w="120" w:type="dxa"/>
+            </w:tcMar>
+            <w:vAlign w:val="center"/>
+            <w:shd w:fill="FFFFFF"/>
+          </w:tcPr>
+          <w:p>
+            <w:pPr>
+              <w:spacing w:before="0" w:after="40" w:line="252" w:lineRule="auto"/>
+              <w:jc w:val="left"/>
+            </w:pPr>
+            <w:r>
+              <w:rPr>
+                <w:rFonts w:ascii="Calibri" w:hAnsi="Calibri"/>
+                <w:b w:val="0"/>
+                <w:color w:val="111827"/>
+                <w:sz w:val="17"/>
+              </w:rPr>
+              <w:t>Catalogue, authorization, and OpenAPI tests</w:t>
+            </w:r>
+          </w:p>
+        </w:tc>
+      </w:tr>
+      <w:tr>
+        <w:trPr>
+          <w:cantSplit/>
+        </w:trPr>
+        <w:tc>
+          <w:tcPr>
+            <w:tcW w:type="dxa" w:w="1650"/>
+            <w:tcMar>
+              <w:top w:w="80" w:type="dxa"/>
+              <w:start w:w="120" w:type="dxa"/>
+              <w:bottom w:w="80" w:type="dxa"/>
+              <w:end w:w="120" w:type="dxa"/>
+            </w:tcMar>
+            <w:vAlign w:val="center"/>
+            <w:shd w:fill="FFFFFF"/>
+          </w:tcPr>
+          <w:p>
+            <w:pPr>
+              <w:spacing w:before="0" w:after="40" w:line="252" w:lineRule="auto"/>
+              <w:jc w:val="center"/>
+            </w:pPr>
+            <w:r>
+              <w:rPr>
+                <w:rFonts w:ascii="Calibri" w:hAnsi="Calibri"/>
+                <w:b w:val="0"/>
+                <w:color w:val="111827"/>
+                <w:sz w:val="17"/>
+              </w:rPr>
+              <w:t>DV-F-023</w:t>
+            </w:r>
+          </w:p>
+        </w:tc>
+        <w:tc>
+          <w:tcPr>
+            <w:tcW w:type="dxa" w:w="4450"/>
+            <w:tcMar>
+              <w:top w:w="80" w:type="dxa"/>
+              <w:start w:w="120" w:type="dxa"/>
+              <w:bottom w:w="80" w:type="dxa"/>
+              <w:end w:w="120" w:type="dxa"/>
+            </w:tcMar>
+            <w:vAlign w:val="center"/>
+            <w:shd w:fill="FFFFFF"/>
+          </w:tcPr>
+          <w:p>
+            <w:pPr>
+              <w:spacing w:before="0" w:after="40" w:line="252" w:lineRule="auto"/>
+              <w:jc w:val="left"/>
+            </w:pPr>
+            <w:r>
+              <w:rPr>
+                <w:rFonts w:ascii="Calibri" w:hAnsi="Calibri"/>
+                <w:b w:val="0"/>
+                <w:color w:val="111827"/>
+                <w:sz w:val="17"/>
+              </w:rPr>
+              <w:t>Mappings shall declare type, access, area, units, and conversion explicitly.</w:t>
+            </w:r>
+          </w:p>
+        </w:tc>
+        <w:tc>
+          <w:tcPr>
+            <w:tcW w:type="dxa" w:w="3260"/>
+            <w:tcMar>
+              <w:top w:w="80" w:type="dxa"/>
+              <w:start w:w="120" w:type="dxa"/>
+              <w:bottom w:w="80" w:type="dxa"/>
+              <w:end w:w="120" w:type="dxa"/>
+            </w:tcMar>
+            <w:vAlign w:val="center"/>
+            <w:shd w:fill="FFFFFF"/>
+          </w:tcPr>
+          <w:p>
+            <w:pPr>
+              <w:spacing w:before="0" w:after="40" w:line="252" w:lineRule="auto"/>
+              <w:jc w:val="left"/>
+            </w:pPr>
+            <w:r>
+              <w:rPr>
+                <w:rFonts w:ascii="Calibri" w:hAnsi="Calibri"/>
+                <w:b w:val="0"/>
+                <w:color w:val="111827"/>
+                <w:sz w:val="17"/>
+              </w:rPr>
+              <w:t>Mapping invariant tests</w:t>
+            </w:r>
+          </w:p>
+        </w:tc>
+      </w:tr>
     </w:tbl>
     <w:p>
       <w:pPr>
@@ -7706,6 +8161,95 @@
                 <w:sz w:val="17"/>
               </w:rPr>
               <w:t>Transaction assertions</w:t>
+            </w:r>
+          </w:p>
+        </w:tc>
+      </w:tr>
+      <w:tr>
+        <w:trPr>
+          <w:cantSplit/>
+        </w:trPr>
+        <w:tc>
+          <w:tcPr>
+            <w:tcW w:type="dxa" w:w="1650"/>
+            <w:tcMar>
+              <w:top w:w="80" w:type="dxa"/>
+              <w:start w:w="120" w:type="dxa"/>
+              <w:bottom w:w="80" w:type="dxa"/>
+              <w:end w:w="120" w:type="dxa"/>
+            </w:tcMar>
+            <w:vAlign w:val="center"/>
+            <w:shd w:fill="FFFFFF"/>
+          </w:tcPr>
+          <w:p>
+            <w:pPr>
+              <w:spacing w:before="0" w:after="40" w:line="252" w:lineRule="auto"/>
+              <w:jc w:val="center"/>
+            </w:pPr>
+            <w:r>
+              <w:rPr>
+                <w:rFonts w:ascii="Calibri" w:hAnsi="Calibri"/>
+                <w:b w:val="0"/>
+                <w:color w:val="111827"/>
+                <w:sz w:val="17"/>
+              </w:rPr>
+              <w:t>DV-NF-011</w:t>
+            </w:r>
+          </w:p>
+        </w:tc>
+        <w:tc>
+          <w:tcPr>
+            <w:tcW w:type="dxa" w:w="4450"/>
+            <w:tcMar>
+              <w:top w:w="80" w:type="dxa"/>
+              <w:start w:w="120" w:type="dxa"/>
+              <w:bottom w:w="80" w:type="dxa"/>
+              <w:end w:w="120" w:type="dxa"/>
+            </w:tcMar>
+            <w:vAlign w:val="center"/>
+            <w:shd w:fill="FFFFFF"/>
+          </w:tcPr>
+          <w:p>
+            <w:pPr>
+              <w:spacing w:before="0" w:after="40" w:line="252" w:lineRule="auto"/>
+              <w:jc w:val="left"/>
+            </w:pPr>
+            <w:r>
+              <w:rPr>
+                <w:rFonts w:ascii="Calibri" w:hAnsi="Calibri"/>
+                <w:b w:val="0"/>
+                <w:color w:val="111827"/>
+                <w:sz w:val="17"/>
+              </w:rPr>
+              <w:t>Symbolic versioned mappings shall isolate ATEP from Android SDK numeric constant values.</w:t>
+            </w:r>
+          </w:p>
+        </w:tc>
+        <w:tc>
+          <w:tcPr>
+            <w:tcW w:type="dxa" w:w="3260"/>
+            <w:tcMar>
+              <w:top w:w="80" w:type="dxa"/>
+              <w:start w:w="120" w:type="dxa"/>
+              <w:bottom w:w="80" w:type="dxa"/>
+              <w:end w:w="120" w:type="dxa"/>
+            </w:tcMar>
+            <w:vAlign w:val="center"/>
+            <w:shd w:fill="FFFFFF"/>
+          </w:tcPr>
+          <w:p>
+            <w:pPr>
+              <w:spacing w:before="0" w:after="40" w:line="252" w:lineRule="auto"/>
+              <w:jc w:val="left"/>
+            </w:pPr>
+            <w:r>
+              <w:rPr>
+                <w:rFonts w:ascii="Calibri" w:hAnsi="Calibri"/>
+                <w:b w:val="0"/>
+                <w:color w:val="111827"/>
+                <w:sz w:val="17"/>
+              </w:rPr>
+              <w:t>Contract review and tests</w:t>
             </w:r>
           </w:p>
         </w:tc>
@@ -8000,6 +8544,54 @@
     </w:p>
     <w:p>
       <w:pPr>
+        <w:pStyle w:val="Heading2"/>
+        <w:keepNext/>
+        <w:keepLines/>
+      </w:pPr>
+      <w:r>
+        <w:t>ADR-DV-006 — Publish Symbolic VHAL Mappings with Explicit Area Semantics</w:t>
+      </w:r>
+    </w:p>
+    <w:p>
+      <w:r>
+        <w:rPr>
+          <w:rFonts w:ascii="Calibri" w:hAnsi="Calibri"/>
+          <w:b/>
+          <w:color w:val="111827"/>
+          <w:sz w:val="22"/>
+        </w:rPr>
+        <w:t>Decision.</w:t>
+      </w:r>
+      <w:r>
+        <w:rPr>
+          <w:rFonts w:ascii="Calibri" w:hAnsi="Calibri"/>
+          <w:color w:val="111827"/>
+          <w:sz w:val="22"/>
+        </w:rPr>
+        <w:t xml:space="preserve"> Publish reviewed Android property symbols, canonical ATEP names, types, access, areas, units, and conversions as an immutable versioned catalogue protected by gateway workload identity.</w:t>
+      </w:r>
+    </w:p>
+    <w:p>
+      <w:r>
+        <w:rPr>
+          <w:rFonts w:ascii="Calibri" w:hAnsi="Calibri"/>
+          <w:b/>
+          <w:color w:val="111827"/>
+          <w:sz w:val="22"/>
+        </w:rPr>
+        <w:t>Rationale.</w:t>
+      </w:r>
+      <w:r>
+        <w:rPr>
+          <w:rFonts w:ascii="Calibri" w:hAnsi="Calibri"/>
+          <w:color w:val="111827"/>
+          <w:sz w:val="22"/>
+        </w:rPr>
+        <w:t xml:space="preserve"> Android integer property constants belong to the selected platform SDK. Symbolic mapping avoids duplicating that authority in Python, while explicit seat/wheel area requirements prevent zoned observations from being silently collapsed into ambiguous global values.</w:t>
+      </w:r>
+    </w:p>
+    <w:p>
+      <w:pPr>
         <w:pStyle w:val="Heading1"/>
         <w:keepNext/>
         <w:keepLines/>
@@ -10963,6 +11555,362 @@
                 <w:sz w:val="17"/>
               </w:rPr>
               <w:t>Session/member/snapshot tables reach the expected schema head</w:t>
+            </w:r>
+          </w:p>
+        </w:tc>
+      </w:tr>
+      <w:tr>
+        <w:trPr>
+          <w:cantSplit/>
+        </w:trPr>
+        <w:tc>
+          <w:tcPr>
+            <w:tcW w:type="dxa" w:w="1650"/>
+            <w:tcMar>
+              <w:top w:w="80" w:type="dxa"/>
+              <w:start w:w="120" w:type="dxa"/>
+              <w:bottom w:w="80" w:type="dxa"/>
+              <w:end w:w="120" w:type="dxa"/>
+            </w:tcMar>
+            <w:vAlign w:val="center"/>
+            <w:shd w:fill="FFFFFF"/>
+          </w:tcPr>
+          <w:p>
+            <w:pPr>
+              <w:spacing w:before="0" w:after="40" w:line="252" w:lineRule="auto"/>
+              <w:jc w:val="center"/>
+            </w:pPr>
+            <w:r>
+              <w:rPr>
+                <w:rFonts w:ascii="Calibri" w:hAnsi="Calibri"/>
+                <w:b w:val="0"/>
+                <w:color w:val="111827"/>
+                <w:sz w:val="17"/>
+              </w:rPr>
+              <w:t>DV-T-033</w:t>
+            </w:r>
+          </w:p>
+        </w:tc>
+        <w:tc>
+          <w:tcPr>
+            <w:tcW w:type="dxa" w:w="4450"/>
+            <w:tcMar>
+              <w:top w:w="80" w:type="dxa"/>
+              <w:start w:w="120" w:type="dxa"/>
+              <w:bottom w:w="80" w:type="dxa"/>
+              <w:end w:w="120" w:type="dxa"/>
+            </w:tcMar>
+            <w:vAlign w:val="center"/>
+            <w:shd w:fill="FFFFFF"/>
+          </w:tcPr>
+          <w:p>
+            <w:pPr>
+              <w:spacing w:before="0" w:after="40" w:line="252" w:lineRule="auto"/>
+              <w:jc w:val="left"/>
+            </w:pPr>
+            <w:r>
+              <w:rPr>
+                <w:rFonts w:ascii="Calibri" w:hAnsi="Calibri"/>
+                <w:b w:val="0"/>
+                <w:color w:val="111827"/>
+                <w:sz w:val="17"/>
+              </w:rPr>
+              <w:t>Inspect the VHAL mapping catalogue</w:t>
+            </w:r>
+          </w:p>
+        </w:tc>
+        <w:tc>
+          <w:tcPr>
+            <w:tcW w:type="dxa" w:w="3260"/>
+            <w:tcMar>
+              <w:top w:w="80" w:type="dxa"/>
+              <w:start w:w="120" w:type="dxa"/>
+              <w:bottom w:w="80" w:type="dxa"/>
+              <w:end w:w="120" w:type="dxa"/>
+            </w:tcMar>
+            <w:vAlign w:val="center"/>
+            <w:shd w:fill="FFFFFF"/>
+          </w:tcPr>
+          <w:p>
+            <w:pPr>
+              <w:spacing w:before="0" w:after="40" w:line="252" w:lineRule="auto"/>
+              <w:jc w:val="left"/>
+            </w:pPr>
+            <w:r>
+              <w:rPr>
+                <w:rFonts w:ascii="Calibri" w:hAnsi="Calibri"/>
+                <w:b w:val="0"/>
+                <w:color w:val="111827"/>
+                <w:sz w:val="17"/>
+              </w:rPr>
+              <w:t>Contract version and Android property symbols are unique</w:t>
+            </w:r>
+          </w:p>
+        </w:tc>
+      </w:tr>
+      <w:tr>
+        <w:trPr>
+          <w:cantSplit/>
+        </w:trPr>
+        <w:tc>
+          <w:tcPr>
+            <w:tcW w:type="dxa" w:w="1650"/>
+            <w:tcMar>
+              <w:top w:w="80" w:type="dxa"/>
+              <w:start w:w="120" w:type="dxa"/>
+              <w:bottom w:w="80" w:type="dxa"/>
+              <w:end w:w="120" w:type="dxa"/>
+            </w:tcMar>
+            <w:vAlign w:val="center"/>
+            <w:shd w:fill="FFFFFF"/>
+          </w:tcPr>
+          <w:p>
+            <w:pPr>
+              <w:spacing w:before="0" w:after="40" w:line="252" w:lineRule="auto"/>
+              <w:jc w:val="center"/>
+            </w:pPr>
+            <w:r>
+              <w:rPr>
+                <w:rFonts w:ascii="Calibri" w:hAnsi="Calibri"/>
+                <w:b w:val="0"/>
+                <w:color w:val="111827"/>
+                <w:sz w:val="17"/>
+              </w:rPr>
+              <w:t>DV-T-034</w:t>
+            </w:r>
+          </w:p>
+        </w:tc>
+        <w:tc>
+          <w:tcPr>
+            <w:tcW w:type="dxa" w:w="4450"/>
+            <w:tcMar>
+              <w:top w:w="80" w:type="dxa"/>
+              <w:start w:w="120" w:type="dxa"/>
+              <w:bottom w:w="80" w:type="dxa"/>
+              <w:end w:w="120" w:type="dxa"/>
+            </w:tcMar>
+            <w:vAlign w:val="center"/>
+            <w:shd w:fill="FFFFFF"/>
+          </w:tcPr>
+          <w:p>
+            <w:pPr>
+              <w:spacing w:before="0" w:after="40" w:line="252" w:lineRule="auto"/>
+              <w:jc w:val="left"/>
+            </w:pPr>
+            <w:r>
+              <w:rPr>
+                <w:rFonts w:ascii="Calibri" w:hAnsi="Calibri"/>
+                <w:b w:val="0"/>
+                <w:color w:val="111827"/>
+                <w:sz w:val="17"/>
+              </w:rPr>
+              <w:t>Inspect speed mapping</w:t>
+            </w:r>
+          </w:p>
+        </w:tc>
+        <w:tc>
+          <w:tcPr>
+            <w:tcW w:type="dxa" w:w="3260"/>
+            <w:tcMar>
+              <w:top w:w="80" w:type="dxa"/>
+              <w:start w:w="120" w:type="dxa"/>
+              <w:bottom w:w="80" w:type="dxa"/>
+              <w:end w:w="120" w:type="dxa"/>
+            </w:tcMar>
+            <w:vAlign w:val="center"/>
+            <w:shd w:fill="FFFFFF"/>
+          </w:tcPr>
+          <w:p>
+            <w:pPr>
+              <w:spacing w:before="0" w:after="40" w:line="252" w:lineRule="auto"/>
+              <w:jc w:val="left"/>
+            </w:pPr>
+            <w:r>
+              <w:rPr>
+                <w:rFonts w:ascii="Calibri" w:hAnsi="Calibri"/>
+                <w:b w:val="0"/>
+                <w:color w:val="111827"/>
+                <w:sz w:val="17"/>
+              </w:rPr>
+              <w:t>Source m/s, target km/h, and conversion are explicit</w:t>
+            </w:r>
+          </w:p>
+        </w:tc>
+      </w:tr>
+      <w:tr>
+        <w:trPr>
+          <w:cantSplit/>
+        </w:trPr>
+        <w:tc>
+          <w:tcPr>
+            <w:tcW w:type="dxa" w:w="1650"/>
+            <w:tcMar>
+              <w:top w:w="80" w:type="dxa"/>
+              <w:start w:w="120" w:type="dxa"/>
+              <w:bottom w:w="80" w:type="dxa"/>
+              <w:end w:w="120" w:type="dxa"/>
+            </w:tcMar>
+            <w:vAlign w:val="center"/>
+            <w:shd w:fill="FFFFFF"/>
+          </w:tcPr>
+          <w:p>
+            <w:pPr>
+              <w:spacing w:before="0" w:after="40" w:line="252" w:lineRule="auto"/>
+              <w:jc w:val="center"/>
+            </w:pPr>
+            <w:r>
+              <w:rPr>
+                <w:rFonts w:ascii="Calibri" w:hAnsi="Calibri"/>
+                <w:b w:val="0"/>
+                <w:color w:val="111827"/>
+                <w:sz w:val="17"/>
+              </w:rPr>
+              <w:t>DV-T-035</w:t>
+            </w:r>
+          </w:p>
+        </w:tc>
+        <w:tc>
+          <w:tcPr>
+            <w:tcW w:type="dxa" w:w="4450"/>
+            <w:tcMar>
+              <w:top w:w="80" w:type="dxa"/>
+              <w:start w:w="120" w:type="dxa"/>
+              <w:bottom w:w="80" w:type="dxa"/>
+              <w:end w:w="120" w:type="dxa"/>
+            </w:tcMar>
+            <w:vAlign w:val="center"/>
+            <w:shd w:fill="FFFFFF"/>
+          </w:tcPr>
+          <w:p>
+            <w:pPr>
+              <w:spacing w:before="0" w:after="40" w:line="252" w:lineRule="auto"/>
+              <w:jc w:val="left"/>
+            </w:pPr>
+            <w:r>
+              <w:rPr>
+                <w:rFonts w:ascii="Calibri" w:hAnsi="Calibri"/>
+                <w:b w:val="0"/>
+                <w:color w:val="111827"/>
+                <w:sz w:val="17"/>
+              </w:rPr>
+              <w:t>Inspect cabin-temperature and tyre-pressure mappings</w:t>
+            </w:r>
+          </w:p>
+        </w:tc>
+        <w:tc>
+          <w:tcPr>
+            <w:tcW w:type="dxa" w:w="3260"/>
+            <w:tcMar>
+              <w:top w:w="80" w:type="dxa"/>
+              <w:start w:w="120" w:type="dxa"/>
+              <w:bottom w:w="80" w:type="dxa"/>
+              <w:end w:w="120" w:type="dxa"/>
+            </w:tcMar>
+            <w:vAlign w:val="center"/>
+            <w:shd w:fill="FFFFFF"/>
+          </w:tcPr>
+          <w:p>
+            <w:pPr>
+              <w:spacing w:before="0" w:after="40" w:line="252" w:lineRule="auto"/>
+              <w:jc w:val="left"/>
+            </w:pPr>
+            <w:r>
+              <w:rPr>
+                <w:rFonts w:ascii="Calibri" w:hAnsi="Calibri"/>
+                <w:b w:val="0"/>
+                <w:color w:val="111827"/>
+                <w:sz w:val="17"/>
+              </w:rPr>
+              <w:t>Seat/wheel area IDs are required while global properties reject that assumption</w:t>
+            </w:r>
+          </w:p>
+        </w:tc>
+      </w:tr>
+      <w:tr>
+        <w:trPr>
+          <w:cantSplit/>
+        </w:trPr>
+        <w:tc>
+          <w:tcPr>
+            <w:tcW w:type="dxa" w:w="1650"/>
+            <w:tcMar>
+              <w:top w:w="80" w:type="dxa"/>
+              <w:start w:w="120" w:type="dxa"/>
+              <w:bottom w:w="80" w:type="dxa"/>
+              <w:end w:w="120" w:type="dxa"/>
+            </w:tcMar>
+            <w:vAlign w:val="center"/>
+            <w:shd w:fill="FFFFFF"/>
+          </w:tcPr>
+          <w:p>
+            <w:pPr>
+              <w:spacing w:before="0" w:after="40" w:line="252" w:lineRule="auto"/>
+              <w:jc w:val="center"/>
+            </w:pPr>
+            <w:r>
+              <w:rPr>
+                <w:rFonts w:ascii="Calibri" w:hAnsi="Calibri"/>
+                <w:b w:val="0"/>
+                <w:color w:val="111827"/>
+                <w:sz w:val="17"/>
+              </w:rPr>
+              <w:t>DV-T-036</w:t>
+            </w:r>
+          </w:p>
+        </w:tc>
+        <w:tc>
+          <w:tcPr>
+            <w:tcW w:type="dxa" w:w="4450"/>
+            <w:tcMar>
+              <w:top w:w="80" w:type="dxa"/>
+              <w:start w:w="120" w:type="dxa"/>
+              <w:bottom w:w="80" w:type="dxa"/>
+              <w:end w:w="120" w:type="dxa"/>
+            </w:tcMar>
+            <w:vAlign w:val="center"/>
+            <w:shd w:fill="FFFFFF"/>
+          </w:tcPr>
+          <w:p>
+            <w:pPr>
+              <w:spacing w:before="0" w:after="40" w:line="252" w:lineRule="auto"/>
+              <w:jc w:val="left"/>
+            </w:pPr>
+            <w:r>
+              <w:rPr>
+                <w:rFonts w:ascii="Calibri" w:hAnsi="Calibri"/>
+                <w:b w:val="0"/>
+                <w:color w:val="111827"/>
+                <w:sz w:val="17"/>
+              </w:rPr>
+              <w:t>Inspect OpenAPI and gateway headers</w:t>
+            </w:r>
+          </w:p>
+        </w:tc>
+        <w:tc>
+          <w:tcPr>
+            <w:tcW w:type="dxa" w:w="3260"/>
+            <w:tcMar>
+              <w:top w:w="80" w:type="dxa"/>
+              <w:start w:w="120" w:type="dxa"/>
+              <w:bottom w:w="80" w:type="dxa"/>
+              <w:end w:w="120" w:type="dxa"/>
+            </w:tcMar>
+            <w:vAlign w:val="center"/>
+            <w:shd w:fill="FFFFFF"/>
+          </w:tcPr>
+          <w:p>
+            <w:pPr>
+              <w:spacing w:before="0" w:after="40" w:line="252" w:lineRule="auto"/>
+              <w:jc w:val="left"/>
+            </w:pPr>
+            <w:r>
+              <w:rPr>
+                <w:rFonts w:ascii="Calibri" w:hAnsi="Calibri"/>
+                <w:b w:val="0"/>
+                <w:color w:val="111827"/>
+                <w:sz w:val="17"/>
+              </w:rPr>
+              <w:t>Mapping response and workload authentication headers are published</w:t>
             </w:r>
           </w:p>
         </w:tc>
@@ -11655,6 +12603,85 @@
                 <w:sz w:val="17"/>
               </w:rPr>
               <w:t>docs/digital-vehicle-state.md</w:t>
+            </w:r>
+          </w:p>
+        </w:tc>
+      </w:tr>
+      <w:tr>
+        <w:trPr>
+          <w:cantSplit/>
+        </w:trPr>
+        <w:tc>
+          <w:tcPr>
+            <w:tcW w:type="dxa" w:w="2700"/>
+            <w:tcMar>
+              <w:top w:w="80" w:type="dxa"/>
+              <w:start w:w="120" w:type="dxa"/>
+              <w:bottom w:w="80" w:type="dxa"/>
+              <w:end w:w="120" w:type="dxa"/>
+            </w:tcMar>
+            <w:vAlign w:val="center"/>
+            <w:shd w:fill="FFFFFF"/>
+          </w:tcPr>
+          <w:p>
+            <w:pPr>
+              <w:spacing w:before="0" w:after="40" w:line="252" w:lineRule="auto"/>
+              <w:jc w:val="left"/>
+            </w:pPr>
+            <w:r>
+              <w:rPr>
+                <w:rFonts w:ascii="Calibri" w:hAnsi="Calibri"/>
+                <w:b w:val="0"/>
+                <w:color w:val="111827"/>
+                <w:sz w:val="17"/>
+              </w:rPr>
+              <w:t>Android Automotive mapping contract</w:t>
+            </w:r>
+          </w:p>
+        </w:tc>
+        <w:tc>
+          <w:tcPr>
+            <w:tcW w:type="dxa" w:w="6660"/>
+            <w:tcMar>
+              <w:top w:w="80" w:type="dxa"/>
+              <w:start w:w="120" w:type="dxa"/>
+              <w:bottom w:w="80" w:type="dxa"/>
+              <w:end w:w="120" w:type="dxa"/>
+            </w:tcMar>
+            <w:vAlign w:val="center"/>
+            <w:shd w:fill="FFFFFF"/>
+          </w:tcPr>
+          <w:p>
+            <w:pPr>
+              <w:spacing w:before="0" w:after="40" w:line="252" w:lineRule="auto"/>
+              <w:jc w:val="left"/>
+            </w:pPr>
+            <w:r>
+              <w:rPr>
+                <w:rFonts w:ascii="Calibri" w:hAnsi="Calibri"/>
+                <w:b w:val="0"/>
+                <w:color w:val="111827"/>
+                <w:sz w:val="17"/>
+              </w:rPr>
+              <w:t>src/atep/vehicles/vhal_contracts.py</w:t>
+            </w:r>
+            <w:r>
+              <w:rPr>
+                <w:rFonts w:ascii="Calibri" w:hAnsi="Calibri"/>
+                <w:b w:val="0"/>
+                <w:color w:val="111827"/>
+                <w:sz w:val="17"/>
+              </w:rPr>
+              <w:t xml:space="preserve"> and </w:t>
+            </w:r>
+            <w:r>
+              <w:rPr>
+                <w:rFonts w:ascii="Calibri" w:hAnsi="Calibri"/>
+                <w:b w:val="0"/>
+                <w:color w:val="111827"/>
+                <w:sz w:val="17"/>
+              </w:rPr>
+              <w:t>src/atep/vehicles/gateway_router.py</w:t>
             </w:r>
           </w:p>
         </w:tc>
@@ -12160,7 +13187,7 @@
                 <w:color w:val="111827"/>
                 <w:sz w:val="17"/>
               </w:rPr>
-              <w:t>No VHAL property mapping</w:t>
+              <w:t>Symbolic mappings require Android-side SDK resolution</w:t>
             </w:r>
           </w:p>
         </w:tc>
@@ -12188,7 +13215,7 @@
                 <w:color w:val="111827"/>
                 <w:sz w:val="17"/>
               </w:rPr>
-              <w:t>CarSystemUI integration remains API/gateway-oriented</w:t>
+              <w:t>A mismatched CarSystemUI SDK may not expose every reviewed property</w:t>
             </w:r>
           </w:p>
         </w:tc>
@@ -12216,7 +13243,7 @@
                 <w:color w:val="111827"/>
                 <w:sz w:val="17"/>
               </w:rPr>
-              <w:t>Add contract mappings and end-to-end evidence in II-6</w:t>
+              <w:t>Validate availability explicitly and retain the existing no-silent-fallback behavior</w:t>
             </w:r>
           </w:p>
         </w:tc>
@@ -12877,7 +13904,7 @@
                 <w:color w:val="111827"/>
                 <w:sz w:val="17"/>
               </w:rPr>
-              <w:t>Planned next</w:t>
+              <w:t>Implemented</w:t>
             </w:r>
           </w:p>
         </w:tc>
@@ -12887,6 +13914,16 @@
       <w:pPr>
         <w:spacing w:after="60"/>
       </w:pPr>
+    </w:p>
+    <w:p>
+      <w:r>
+        <w:rPr>
+          <w:rFonts w:ascii="Calibri" w:hAnsi="Calibri"/>
+          <w:color w:val="111827"/>
+          <w:sz w:val="22"/>
+        </w:rPr>
+        <w:t>The recommended next increment begins Volume III with a bounded ECU aggregate and lifecycle before adding CAN or diagnostic protocol behavior.</w:t>
+      </w:r>
     </w:p>
     <w:p>
       <w:pPr>
@@ -13029,7 +14066,7 @@
         <w:color w:val="667085"/>
         <w:sz w:val="17"/>
       </w:rPr>
-      <w:t>ATEP Volume II Workbook  |  Version 0.5.0</w:t>
+      <w:t>ATEP Volume II Workbook  |  Version 0.6.0</w:t>
     </w:r>
     <w:r>
       <w:rPr>

</xml_diff>

<commit_message>
Complete Volume II AAOS/VHAL mapping contract (#49)
* Add versioned AAOS VHAL mapping contract

* Document temporary OpenSSL QUIC exception
</commit_message>
<xml_diff>
--- a/docs/ATEP_Volume_II_Digital_Vehicle_Engineering_Workbook.docx
+++ b/docs/ATEP_Volume_II_Digital_Vehicle_Engineering_Workbook.docx
@@ -143,7 +143,7 @@
                 <w:color w:val="0B2545"/>
                 <w:sz w:val="19"/>
               </w:rPr>
-              <w:t>0.5.0</w:t>
+              <w:t>0.6.0</w:t>
             </w:r>
           </w:p>
         </w:tc>
@@ -265,7 +265,7 @@
                 <w:color w:val="111827"/>
                 <w:sz w:val="19"/>
               </w:rPr>
-              <w:t>Living document - Increments II-1 through II-5 implemented</w:t>
+              <w:t>Living document - Increments II-1 through II-6 implemented</w:t>
             </w:r>
           </w:p>
         </w:tc>
@@ -1850,6 +1850,123 @@
           </w:p>
         </w:tc>
       </w:tr>
+      <w:tr>
+        <w:trPr>
+          <w:cantSplit/>
+        </w:trPr>
+        <w:tc>
+          <w:tcPr>
+            <w:tcW w:type="dxa" w:w="1150"/>
+            <w:tcMar>
+              <w:top w:w="80" w:type="dxa"/>
+              <w:start w:w="120" w:type="dxa"/>
+              <w:bottom w:w="80" w:type="dxa"/>
+              <w:end w:w="120" w:type="dxa"/>
+            </w:tcMar>
+            <w:vAlign w:val="center"/>
+            <w:shd w:fill="FFFFFF"/>
+          </w:tcPr>
+          <w:p>
+            <w:pPr>
+              <w:spacing w:before="0" w:after="40" w:line="252" w:lineRule="auto"/>
+              <w:jc w:val="center"/>
+            </w:pPr>
+            <w:r>
+              <w:rPr>
+                <w:rFonts w:ascii="Calibri" w:hAnsi="Calibri"/>
+                <w:b w:val="0"/>
+                <w:color w:val="111827"/>
+                <w:sz w:val="16"/>
+              </w:rPr>
+              <w:t>0.6.0</w:t>
+            </w:r>
+          </w:p>
+        </w:tc>
+        <w:tc>
+          <w:tcPr>
+            <w:tcW w:type="dxa" w:w="1400"/>
+            <w:tcMar>
+              <w:top w:w="80" w:type="dxa"/>
+              <w:start w:w="120" w:type="dxa"/>
+              <w:bottom w:w="80" w:type="dxa"/>
+              <w:end w:w="120" w:type="dxa"/>
+            </w:tcMar>
+            <w:vAlign w:val="center"/>
+            <w:shd w:fill="FFFFFF"/>
+          </w:tcPr>
+          <w:p>
+            <w:pPr>
+              <w:spacing w:before="0" w:after="40" w:line="252" w:lineRule="auto"/>
+              <w:jc w:val="left"/>
+            </w:pPr>
+            <w:r>
+              <w:rPr>
+                <w:rFonts w:ascii="Calibri" w:hAnsi="Calibri"/>
+                <w:b w:val="0"/>
+                <w:color w:val="111827"/>
+                <w:sz w:val="16"/>
+              </w:rPr>
+              <w:t>24 August 2026</w:t>
+            </w:r>
+          </w:p>
+        </w:tc>
+        <w:tc>
+          <w:tcPr>
+            <w:tcW w:type="dxa" w:w="3450"/>
+            <w:tcMar>
+              <w:top w:w="80" w:type="dxa"/>
+              <w:start w:w="120" w:type="dxa"/>
+              <w:bottom w:w="80" w:type="dxa"/>
+              <w:end w:w="120" w:type="dxa"/>
+            </w:tcMar>
+            <w:vAlign w:val="center"/>
+            <w:shd w:fill="FFFFFF"/>
+          </w:tcPr>
+          <w:p>
+            <w:pPr>
+              <w:spacing w:before="0" w:after="40" w:line="252" w:lineRule="auto"/>
+              <w:jc w:val="left"/>
+            </w:pPr>
+            <w:r>
+              <w:rPr>
+                <w:rFonts w:ascii="Calibri" w:hAnsi="Calibri"/>
+                <w:b w:val="0"/>
+                <w:color w:val="111827"/>
+                <w:sz w:val="16"/>
+              </w:rPr>
+              <w:t>II-6: published the telemetry-authorized, versioned Android Automotive/VHAL mapping catalogue with explicit types, access, units, conversions, and global/seat/wheel area semantics</w:t>
+            </w:r>
+          </w:p>
+        </w:tc>
+        <w:tc>
+          <w:tcPr>
+            <w:tcW w:type="dxa" w:w="3360"/>
+            <w:tcMar>
+              <w:top w:w="80" w:type="dxa"/>
+              <w:start w:w="120" w:type="dxa"/>
+              <w:bottom w:w="80" w:type="dxa"/>
+              <w:end w:w="120" w:type="dxa"/>
+            </w:tcMar>
+            <w:vAlign w:val="center"/>
+            <w:shd w:fill="FFFFFF"/>
+          </w:tcPr>
+          <w:p>
+            <w:pPr>
+              <w:spacing w:before="0" w:after="40" w:line="252" w:lineRule="auto"/>
+              <w:jc w:val="left"/>
+            </w:pPr>
+            <w:r>
+              <w:rPr>
+                <w:rFonts w:ascii="Calibri" w:hAnsi="Calibri"/>
+                <w:b w:val="0"/>
+                <w:color w:val="111827"/>
+                <w:sz w:val="16"/>
+              </w:rPr>
+              <w:t>Implemented and verified by focused catalogue and OpenAPI tests, combined with the existing live CarSystemUI telemetry/command evidence</w:t>
+            </w:r>
+          </w:p>
+        </w:tc>
+      </w:tr>
     </w:tbl>
     <w:p>
       <w:pPr>
@@ -2026,7 +2143,7 @@
           <w:color w:val="111827"/>
           <w:sz w:val="22"/>
         </w:rPr>
-        <w:t>compatibility boundary for the future Android Automotive Vehicle Gateway.</w:t>
+        <w:t>a versioned Android Automotive/VHAL mapping catalogue for the Vehicle Gateway.</w:t>
       </w:r>
     </w:p>
     <w:p>
@@ -2121,7 +2238,7 @@
           <w:color w:val="111827"/>
           <w:sz w:val="22"/>
         </w:rPr>
-        <w:t>multi-vehicle sessions and distributed simulation scheduling;</w:t>
+        <w:t>distributed real-time simulation scheduling;</w:t>
       </w:r>
     </w:p>
     <w:p>
@@ -4330,6 +4447,104 @@
                 <w:sz w:val="17"/>
               </w:rPr>
               <w:t>Restore isolated member state and logical time</w:t>
+            </w:r>
+          </w:p>
+        </w:tc>
+      </w:tr>
+      <w:tr>
+        <w:trPr>
+          <w:cantSplit/>
+        </w:trPr>
+        <w:tc>
+          <w:tcPr>
+            <w:tcW w:type="dxa" w:w="1650"/>
+            <w:tcMar>
+              <w:top w:w="80" w:type="dxa"/>
+              <w:start w:w="120" w:type="dxa"/>
+              <w:bottom w:w="80" w:type="dxa"/>
+              <w:end w:w="120" w:type="dxa"/>
+            </w:tcMar>
+            <w:vAlign w:val="center"/>
+            <w:shd w:fill="FFFFFF"/>
+          </w:tcPr>
+          <w:p>
+            <w:pPr>
+              <w:spacing w:before="0" w:after="40" w:line="252" w:lineRule="auto"/>
+              <w:jc w:val="center"/>
+            </w:pPr>
+            <w:r>
+              <w:rPr>
+                <w:rFonts w:ascii="Calibri" w:hAnsi="Calibri"/>
+                <w:b w:val="0"/>
+                <w:color w:val="111827"/>
+                <w:sz w:val="17"/>
+              </w:rPr>
+              <w:t>GET /api/v1/vehicle-gateway/vhal-mappings</w:t>
+            </w:r>
+          </w:p>
+        </w:tc>
+        <w:tc>
+          <w:tcPr>
+            <w:tcW w:type="dxa" w:w="4450"/>
+            <w:tcMar>
+              <w:top w:w="80" w:type="dxa"/>
+              <w:start w:w="120" w:type="dxa"/>
+              <w:bottom w:w="80" w:type="dxa"/>
+              <w:end w:w="120" w:type="dxa"/>
+            </w:tcMar>
+            <w:vAlign w:val="center"/>
+            <w:shd w:fill="FFFFFF"/>
+          </w:tcPr>
+          <w:p>
+            <w:pPr>
+              <w:spacing w:before="0" w:after="40" w:line="252" w:lineRule="auto"/>
+              <w:jc w:val="left"/>
+            </w:pPr>
+            <w:r>
+              <w:rPr>
+                <w:rFonts w:ascii="Calibri" w:hAnsi="Calibri"/>
+                <w:b w:val="0"/>
+                <w:color w:val="111827"/>
+                <w:sz w:val="17"/>
+              </w:rPr>
+              <w:t xml:space="preserve">Gateway module with </w:t>
+            </w:r>
+            <w:r>
+              <w:rPr>
+                <w:rFonts w:ascii="Calibri" w:hAnsi="Calibri"/>
+                <w:b w:val="0"/>
+                <w:color w:val="111827"/>
+                <w:sz w:val="17"/>
+              </w:rPr>
+              <w:t>vehicle.telemetry.publish</w:t>
+            </w:r>
+          </w:p>
+        </w:tc>
+        <w:tc>
+          <w:tcPr>
+            <w:tcW w:type="dxa" w:w="3260"/>
+            <w:tcMar>
+              <w:top w:w="80" w:type="dxa"/>
+              <w:start w:w="120" w:type="dxa"/>
+              <w:bottom w:w="80" w:type="dxa"/>
+              <w:end w:w="120" w:type="dxa"/>
+            </w:tcMar>
+            <w:vAlign w:val="center"/>
+            <w:shd w:fill="FFFFFF"/>
+          </w:tcPr>
+          <w:p>
+            <w:pPr>
+              <w:spacing w:before="0" w:after="40" w:line="252" w:lineRule="auto"/>
+              <w:jc w:val="left"/>
+            </w:pPr>
+            <w:r>
+              <w:rPr>
+                <w:rFonts w:ascii="Calibri" w:hAnsi="Calibri"/>
+                <w:b w:val="0"/>
+                <w:color w:val="111827"/>
+                <w:sz w:val="17"/>
+              </w:rPr>
+              <w:t>Retrieve the reviewed versioned AAOS/VHAL mapping catalogue</w:t>
             </w:r>
           </w:p>
         </w:tc>
@@ -4550,6 +4765,68 @@
     </w:p>
     <w:p>
       <w:pPr>
+        <w:pStyle w:val="Heading2"/>
+        <w:keepNext/>
+        <w:keepLines/>
+      </w:pPr>
+      <w:r>
+        <w:t>6.6 Android Automotive/VHAL Mapping Contract</w:t>
+      </w:r>
+    </w:p>
+    <w:p>
+      <w:r>
+        <w:rPr>
+          <w:rFonts w:ascii="Calibri" w:hAnsi="Calibri"/>
+          <w:color w:val="111827"/>
+          <w:sz w:val="22"/>
+        </w:rPr>
+        <w:t xml:space="preserve">The II-6 catalogue maps symbolic Android </w:t>
+      </w:r>
+      <w:r>
+        <w:rPr>
+          <w:rFonts w:ascii="Consolas" w:hAnsi="Consolas"/>
+          <w:color w:val="1F4D78"/>
+          <w:sz w:val="19"/>
+        </w:rPr>
+        <w:t>VehiclePropertyIds</w:t>
+      </w:r>
+      <w:r>
+        <w:rPr>
+          <w:rFonts w:ascii="Calibri" w:hAnsi="Calibri"/>
+          <w:color w:val="111827"/>
+          <w:sz w:val="22"/>
+        </w:rPr>
+        <w:t xml:space="preserve"> names to canonical ATEP property names. It intentionally publishes symbols rather than copying Android integer constants: the CarSystemUI build resolves those constants from its selected Android SDK, while the backend contract remains stable and reviewable. Each entry declares value type, read/read-write access, global/seat/wheel area semantics, source and target units, and any required conversion.</w:t>
+      </w:r>
+    </w:p>
+    <w:p>
+      <w:r>
+        <w:rPr>
+          <w:rFonts w:ascii="Calibri" w:hAnsi="Calibri"/>
+          <w:color w:val="111827"/>
+          <w:sz w:val="22"/>
+        </w:rPr>
+        <w:t xml:space="preserve">The first catalogue covers speed, gear, ignition, EV battery energy/capacity, charging-port state, hybrid fuel level, zoned cabin temperature, and wheel-specific tyre pressure. Retrieval requires an authenticated module declaring </w:t>
+      </w:r>
+      <w:r>
+        <w:rPr>
+          <w:rFonts w:ascii="Consolas" w:hAnsi="Consolas"/>
+          <w:color w:val="1F4D78"/>
+          <w:sz w:val="19"/>
+        </w:rPr>
+        <w:t>vehicle.telemetry.publish</w:t>
+      </w:r>
+      <w:r>
+        <w:rPr>
+          <w:rFonts w:ascii="Calibri" w:hAnsi="Calibri"/>
+          <w:color w:val="111827"/>
+          <w:sz w:val="22"/>
+        </w:rPr>
+        <w:t>. The gateway still communicates only through the public ATEP API and receives no PostgreSQL, Redis, or RabbitMQ access.</w:t>
+      </w:r>
+    </w:p>
+    <w:p>
+      <w:pPr>
         <w:pStyle w:val="Heading1"/>
         <w:keepNext/>
         <w:keepLines/>
@@ -6693,6 +6970,184 @@
           </w:p>
         </w:tc>
       </w:tr>
+      <w:tr>
+        <w:trPr>
+          <w:cantSplit/>
+        </w:trPr>
+        <w:tc>
+          <w:tcPr>
+            <w:tcW w:type="dxa" w:w="1650"/>
+            <w:tcMar>
+              <w:top w:w="80" w:type="dxa"/>
+              <w:start w:w="120" w:type="dxa"/>
+              <w:bottom w:w="80" w:type="dxa"/>
+              <w:end w:w="120" w:type="dxa"/>
+            </w:tcMar>
+            <w:vAlign w:val="center"/>
+            <w:shd w:fill="FFFFFF"/>
+          </w:tcPr>
+          <w:p>
+            <w:pPr>
+              <w:spacing w:before="0" w:after="40" w:line="252" w:lineRule="auto"/>
+              <w:jc w:val="center"/>
+            </w:pPr>
+            <w:r>
+              <w:rPr>
+                <w:rFonts w:ascii="Calibri" w:hAnsi="Calibri"/>
+                <w:b w:val="0"/>
+                <w:color w:val="111827"/>
+                <w:sz w:val="17"/>
+              </w:rPr>
+              <w:t>DV-F-022</w:t>
+            </w:r>
+          </w:p>
+        </w:tc>
+        <w:tc>
+          <w:tcPr>
+            <w:tcW w:type="dxa" w:w="4450"/>
+            <w:tcMar>
+              <w:top w:w="80" w:type="dxa"/>
+              <w:start w:w="120" w:type="dxa"/>
+              <w:bottom w:w="80" w:type="dxa"/>
+              <w:end w:w="120" w:type="dxa"/>
+            </w:tcMar>
+            <w:vAlign w:val="center"/>
+            <w:shd w:fill="FFFFFF"/>
+          </w:tcPr>
+          <w:p>
+            <w:pPr>
+              <w:spacing w:before="0" w:after="40" w:line="252" w:lineRule="auto"/>
+              <w:jc w:val="left"/>
+            </w:pPr>
+            <w:r>
+              <w:rPr>
+                <w:rFonts w:ascii="Calibri" w:hAnsi="Calibri"/>
+                <w:b w:val="0"/>
+                <w:color w:val="111827"/>
+                <w:sz w:val="17"/>
+              </w:rPr>
+              <w:t>A telemetry-authorized gateway shall retrieve one versioned symbolic VHAL mapping catalogue.</w:t>
+            </w:r>
+          </w:p>
+        </w:tc>
+        <w:tc>
+          <w:tcPr>
+            <w:tcW w:type="dxa" w:w="3260"/>
+            <w:tcMar>
+              <w:top w:w="80" w:type="dxa"/>
+              <w:start w:w="120" w:type="dxa"/>
+              <w:bottom w:w="80" w:type="dxa"/>
+              <w:end w:w="120" w:type="dxa"/>
+            </w:tcMar>
+            <w:vAlign w:val="center"/>
+            <w:shd w:fill="FFFFFF"/>
+          </w:tcPr>
+          <w:p>
+            <w:pPr>
+              <w:spacing w:before="0" w:after="40" w:line="252" w:lineRule="auto"/>
+              <w:jc w:val="left"/>
+            </w:pPr>
+            <w:r>
+              <w:rPr>
+                <w:rFonts w:ascii="Calibri" w:hAnsi="Calibri"/>
+                <w:b w:val="0"/>
+                <w:color w:val="111827"/>
+                <w:sz w:val="17"/>
+              </w:rPr>
+              <w:t>Catalogue, authorization, and OpenAPI tests</w:t>
+            </w:r>
+          </w:p>
+        </w:tc>
+      </w:tr>
+      <w:tr>
+        <w:trPr>
+          <w:cantSplit/>
+        </w:trPr>
+        <w:tc>
+          <w:tcPr>
+            <w:tcW w:type="dxa" w:w="1650"/>
+            <w:tcMar>
+              <w:top w:w="80" w:type="dxa"/>
+              <w:start w:w="120" w:type="dxa"/>
+              <w:bottom w:w="80" w:type="dxa"/>
+              <w:end w:w="120" w:type="dxa"/>
+            </w:tcMar>
+            <w:vAlign w:val="center"/>
+            <w:shd w:fill="FFFFFF"/>
+          </w:tcPr>
+          <w:p>
+            <w:pPr>
+              <w:spacing w:before="0" w:after="40" w:line="252" w:lineRule="auto"/>
+              <w:jc w:val="center"/>
+            </w:pPr>
+            <w:r>
+              <w:rPr>
+                <w:rFonts w:ascii="Calibri" w:hAnsi="Calibri"/>
+                <w:b w:val="0"/>
+                <w:color w:val="111827"/>
+                <w:sz w:val="17"/>
+              </w:rPr>
+              <w:t>DV-F-023</w:t>
+            </w:r>
+          </w:p>
+        </w:tc>
+        <w:tc>
+          <w:tcPr>
+            <w:tcW w:type="dxa" w:w="4450"/>
+            <w:tcMar>
+              <w:top w:w="80" w:type="dxa"/>
+              <w:start w:w="120" w:type="dxa"/>
+              <w:bottom w:w="80" w:type="dxa"/>
+              <w:end w:w="120" w:type="dxa"/>
+            </w:tcMar>
+            <w:vAlign w:val="center"/>
+            <w:shd w:fill="FFFFFF"/>
+          </w:tcPr>
+          <w:p>
+            <w:pPr>
+              <w:spacing w:before="0" w:after="40" w:line="252" w:lineRule="auto"/>
+              <w:jc w:val="left"/>
+            </w:pPr>
+            <w:r>
+              <w:rPr>
+                <w:rFonts w:ascii="Calibri" w:hAnsi="Calibri"/>
+                <w:b w:val="0"/>
+                <w:color w:val="111827"/>
+                <w:sz w:val="17"/>
+              </w:rPr>
+              <w:t>Mappings shall declare type, access, area, units, and conversion explicitly.</w:t>
+            </w:r>
+          </w:p>
+        </w:tc>
+        <w:tc>
+          <w:tcPr>
+            <w:tcW w:type="dxa" w:w="3260"/>
+            <w:tcMar>
+              <w:top w:w="80" w:type="dxa"/>
+              <w:start w:w="120" w:type="dxa"/>
+              <w:bottom w:w="80" w:type="dxa"/>
+              <w:end w:w="120" w:type="dxa"/>
+            </w:tcMar>
+            <w:vAlign w:val="center"/>
+            <w:shd w:fill="FFFFFF"/>
+          </w:tcPr>
+          <w:p>
+            <w:pPr>
+              <w:spacing w:before="0" w:after="40" w:line="252" w:lineRule="auto"/>
+              <w:jc w:val="left"/>
+            </w:pPr>
+            <w:r>
+              <w:rPr>
+                <w:rFonts w:ascii="Calibri" w:hAnsi="Calibri"/>
+                <w:b w:val="0"/>
+                <w:color w:val="111827"/>
+                <w:sz w:val="17"/>
+              </w:rPr>
+              <w:t>Mapping invariant tests</w:t>
+            </w:r>
+          </w:p>
+        </w:tc>
+      </w:tr>
     </w:tbl>
     <w:p>
       <w:pPr>
@@ -7706,6 +8161,95 @@
                 <w:sz w:val="17"/>
               </w:rPr>
               <w:t>Transaction assertions</w:t>
+            </w:r>
+          </w:p>
+        </w:tc>
+      </w:tr>
+      <w:tr>
+        <w:trPr>
+          <w:cantSplit/>
+        </w:trPr>
+        <w:tc>
+          <w:tcPr>
+            <w:tcW w:type="dxa" w:w="1650"/>
+            <w:tcMar>
+              <w:top w:w="80" w:type="dxa"/>
+              <w:start w:w="120" w:type="dxa"/>
+              <w:bottom w:w="80" w:type="dxa"/>
+              <w:end w:w="120" w:type="dxa"/>
+            </w:tcMar>
+            <w:vAlign w:val="center"/>
+            <w:shd w:fill="FFFFFF"/>
+          </w:tcPr>
+          <w:p>
+            <w:pPr>
+              <w:spacing w:before="0" w:after="40" w:line="252" w:lineRule="auto"/>
+              <w:jc w:val="center"/>
+            </w:pPr>
+            <w:r>
+              <w:rPr>
+                <w:rFonts w:ascii="Calibri" w:hAnsi="Calibri"/>
+                <w:b w:val="0"/>
+                <w:color w:val="111827"/>
+                <w:sz w:val="17"/>
+              </w:rPr>
+              <w:t>DV-NF-011</w:t>
+            </w:r>
+          </w:p>
+        </w:tc>
+        <w:tc>
+          <w:tcPr>
+            <w:tcW w:type="dxa" w:w="4450"/>
+            <w:tcMar>
+              <w:top w:w="80" w:type="dxa"/>
+              <w:start w:w="120" w:type="dxa"/>
+              <w:bottom w:w="80" w:type="dxa"/>
+              <w:end w:w="120" w:type="dxa"/>
+            </w:tcMar>
+            <w:vAlign w:val="center"/>
+            <w:shd w:fill="FFFFFF"/>
+          </w:tcPr>
+          <w:p>
+            <w:pPr>
+              <w:spacing w:before="0" w:after="40" w:line="252" w:lineRule="auto"/>
+              <w:jc w:val="left"/>
+            </w:pPr>
+            <w:r>
+              <w:rPr>
+                <w:rFonts w:ascii="Calibri" w:hAnsi="Calibri"/>
+                <w:b w:val="0"/>
+                <w:color w:val="111827"/>
+                <w:sz w:val="17"/>
+              </w:rPr>
+              <w:t>Symbolic versioned mappings shall isolate ATEP from Android SDK numeric constant values.</w:t>
+            </w:r>
+          </w:p>
+        </w:tc>
+        <w:tc>
+          <w:tcPr>
+            <w:tcW w:type="dxa" w:w="3260"/>
+            <w:tcMar>
+              <w:top w:w="80" w:type="dxa"/>
+              <w:start w:w="120" w:type="dxa"/>
+              <w:bottom w:w="80" w:type="dxa"/>
+              <w:end w:w="120" w:type="dxa"/>
+            </w:tcMar>
+            <w:vAlign w:val="center"/>
+            <w:shd w:fill="FFFFFF"/>
+          </w:tcPr>
+          <w:p>
+            <w:pPr>
+              <w:spacing w:before="0" w:after="40" w:line="252" w:lineRule="auto"/>
+              <w:jc w:val="left"/>
+            </w:pPr>
+            <w:r>
+              <w:rPr>
+                <w:rFonts w:ascii="Calibri" w:hAnsi="Calibri"/>
+                <w:b w:val="0"/>
+                <w:color w:val="111827"/>
+                <w:sz w:val="17"/>
+              </w:rPr>
+              <w:t>Contract review and tests</w:t>
             </w:r>
           </w:p>
         </w:tc>
@@ -8000,6 +8544,54 @@
     </w:p>
     <w:p>
       <w:pPr>
+        <w:pStyle w:val="Heading2"/>
+        <w:keepNext/>
+        <w:keepLines/>
+      </w:pPr>
+      <w:r>
+        <w:t>ADR-DV-006 — Publish Symbolic VHAL Mappings with Explicit Area Semantics</w:t>
+      </w:r>
+    </w:p>
+    <w:p>
+      <w:r>
+        <w:rPr>
+          <w:rFonts w:ascii="Calibri" w:hAnsi="Calibri"/>
+          <w:b/>
+          <w:color w:val="111827"/>
+          <w:sz w:val="22"/>
+        </w:rPr>
+        <w:t>Decision.</w:t>
+      </w:r>
+      <w:r>
+        <w:rPr>
+          <w:rFonts w:ascii="Calibri" w:hAnsi="Calibri"/>
+          <w:color w:val="111827"/>
+          <w:sz w:val="22"/>
+        </w:rPr>
+        <w:t xml:space="preserve"> Publish reviewed Android property symbols, canonical ATEP names, types, access, areas, units, and conversions as an immutable versioned catalogue protected by gateway workload identity.</w:t>
+      </w:r>
+    </w:p>
+    <w:p>
+      <w:r>
+        <w:rPr>
+          <w:rFonts w:ascii="Calibri" w:hAnsi="Calibri"/>
+          <w:b/>
+          <w:color w:val="111827"/>
+          <w:sz w:val="22"/>
+        </w:rPr>
+        <w:t>Rationale.</w:t>
+      </w:r>
+      <w:r>
+        <w:rPr>
+          <w:rFonts w:ascii="Calibri" w:hAnsi="Calibri"/>
+          <w:color w:val="111827"/>
+          <w:sz w:val="22"/>
+        </w:rPr>
+        <w:t xml:space="preserve"> Android integer property constants belong to the selected platform SDK. Symbolic mapping avoids duplicating that authority in Python, while explicit seat/wheel area requirements prevent zoned observations from being silently collapsed into ambiguous global values.</w:t>
+      </w:r>
+    </w:p>
+    <w:p>
+      <w:pPr>
         <w:pStyle w:val="Heading1"/>
         <w:keepNext/>
         <w:keepLines/>
@@ -10963,6 +11555,362 @@
                 <w:sz w:val="17"/>
               </w:rPr>
               <w:t>Session/member/snapshot tables reach the expected schema head</w:t>
+            </w:r>
+          </w:p>
+        </w:tc>
+      </w:tr>
+      <w:tr>
+        <w:trPr>
+          <w:cantSplit/>
+        </w:trPr>
+        <w:tc>
+          <w:tcPr>
+            <w:tcW w:type="dxa" w:w="1650"/>
+            <w:tcMar>
+              <w:top w:w="80" w:type="dxa"/>
+              <w:start w:w="120" w:type="dxa"/>
+              <w:bottom w:w="80" w:type="dxa"/>
+              <w:end w:w="120" w:type="dxa"/>
+            </w:tcMar>
+            <w:vAlign w:val="center"/>
+            <w:shd w:fill="FFFFFF"/>
+          </w:tcPr>
+          <w:p>
+            <w:pPr>
+              <w:spacing w:before="0" w:after="40" w:line="252" w:lineRule="auto"/>
+              <w:jc w:val="center"/>
+            </w:pPr>
+            <w:r>
+              <w:rPr>
+                <w:rFonts w:ascii="Calibri" w:hAnsi="Calibri"/>
+                <w:b w:val="0"/>
+                <w:color w:val="111827"/>
+                <w:sz w:val="17"/>
+              </w:rPr>
+              <w:t>DV-T-033</w:t>
+            </w:r>
+          </w:p>
+        </w:tc>
+        <w:tc>
+          <w:tcPr>
+            <w:tcW w:type="dxa" w:w="4450"/>
+            <w:tcMar>
+              <w:top w:w="80" w:type="dxa"/>
+              <w:start w:w="120" w:type="dxa"/>
+              <w:bottom w:w="80" w:type="dxa"/>
+              <w:end w:w="120" w:type="dxa"/>
+            </w:tcMar>
+            <w:vAlign w:val="center"/>
+            <w:shd w:fill="FFFFFF"/>
+          </w:tcPr>
+          <w:p>
+            <w:pPr>
+              <w:spacing w:before="0" w:after="40" w:line="252" w:lineRule="auto"/>
+              <w:jc w:val="left"/>
+            </w:pPr>
+            <w:r>
+              <w:rPr>
+                <w:rFonts w:ascii="Calibri" w:hAnsi="Calibri"/>
+                <w:b w:val="0"/>
+                <w:color w:val="111827"/>
+                <w:sz w:val="17"/>
+              </w:rPr>
+              <w:t>Inspect the VHAL mapping catalogue</w:t>
+            </w:r>
+          </w:p>
+        </w:tc>
+        <w:tc>
+          <w:tcPr>
+            <w:tcW w:type="dxa" w:w="3260"/>
+            <w:tcMar>
+              <w:top w:w="80" w:type="dxa"/>
+              <w:start w:w="120" w:type="dxa"/>
+              <w:bottom w:w="80" w:type="dxa"/>
+              <w:end w:w="120" w:type="dxa"/>
+            </w:tcMar>
+            <w:vAlign w:val="center"/>
+            <w:shd w:fill="FFFFFF"/>
+          </w:tcPr>
+          <w:p>
+            <w:pPr>
+              <w:spacing w:before="0" w:after="40" w:line="252" w:lineRule="auto"/>
+              <w:jc w:val="left"/>
+            </w:pPr>
+            <w:r>
+              <w:rPr>
+                <w:rFonts w:ascii="Calibri" w:hAnsi="Calibri"/>
+                <w:b w:val="0"/>
+                <w:color w:val="111827"/>
+                <w:sz w:val="17"/>
+              </w:rPr>
+              <w:t>Contract version and Android property symbols are unique</w:t>
+            </w:r>
+          </w:p>
+        </w:tc>
+      </w:tr>
+      <w:tr>
+        <w:trPr>
+          <w:cantSplit/>
+        </w:trPr>
+        <w:tc>
+          <w:tcPr>
+            <w:tcW w:type="dxa" w:w="1650"/>
+            <w:tcMar>
+              <w:top w:w="80" w:type="dxa"/>
+              <w:start w:w="120" w:type="dxa"/>
+              <w:bottom w:w="80" w:type="dxa"/>
+              <w:end w:w="120" w:type="dxa"/>
+            </w:tcMar>
+            <w:vAlign w:val="center"/>
+            <w:shd w:fill="FFFFFF"/>
+          </w:tcPr>
+          <w:p>
+            <w:pPr>
+              <w:spacing w:before="0" w:after="40" w:line="252" w:lineRule="auto"/>
+              <w:jc w:val="center"/>
+            </w:pPr>
+            <w:r>
+              <w:rPr>
+                <w:rFonts w:ascii="Calibri" w:hAnsi="Calibri"/>
+                <w:b w:val="0"/>
+                <w:color w:val="111827"/>
+                <w:sz w:val="17"/>
+              </w:rPr>
+              <w:t>DV-T-034</w:t>
+            </w:r>
+          </w:p>
+        </w:tc>
+        <w:tc>
+          <w:tcPr>
+            <w:tcW w:type="dxa" w:w="4450"/>
+            <w:tcMar>
+              <w:top w:w="80" w:type="dxa"/>
+              <w:start w:w="120" w:type="dxa"/>
+              <w:bottom w:w="80" w:type="dxa"/>
+              <w:end w:w="120" w:type="dxa"/>
+            </w:tcMar>
+            <w:vAlign w:val="center"/>
+            <w:shd w:fill="FFFFFF"/>
+          </w:tcPr>
+          <w:p>
+            <w:pPr>
+              <w:spacing w:before="0" w:after="40" w:line="252" w:lineRule="auto"/>
+              <w:jc w:val="left"/>
+            </w:pPr>
+            <w:r>
+              <w:rPr>
+                <w:rFonts w:ascii="Calibri" w:hAnsi="Calibri"/>
+                <w:b w:val="0"/>
+                <w:color w:val="111827"/>
+                <w:sz w:val="17"/>
+              </w:rPr>
+              <w:t>Inspect speed mapping</w:t>
+            </w:r>
+          </w:p>
+        </w:tc>
+        <w:tc>
+          <w:tcPr>
+            <w:tcW w:type="dxa" w:w="3260"/>
+            <w:tcMar>
+              <w:top w:w="80" w:type="dxa"/>
+              <w:start w:w="120" w:type="dxa"/>
+              <w:bottom w:w="80" w:type="dxa"/>
+              <w:end w:w="120" w:type="dxa"/>
+            </w:tcMar>
+            <w:vAlign w:val="center"/>
+            <w:shd w:fill="FFFFFF"/>
+          </w:tcPr>
+          <w:p>
+            <w:pPr>
+              <w:spacing w:before="0" w:after="40" w:line="252" w:lineRule="auto"/>
+              <w:jc w:val="left"/>
+            </w:pPr>
+            <w:r>
+              <w:rPr>
+                <w:rFonts w:ascii="Calibri" w:hAnsi="Calibri"/>
+                <w:b w:val="0"/>
+                <w:color w:val="111827"/>
+                <w:sz w:val="17"/>
+              </w:rPr>
+              <w:t>Source m/s, target km/h, and conversion are explicit</w:t>
+            </w:r>
+          </w:p>
+        </w:tc>
+      </w:tr>
+      <w:tr>
+        <w:trPr>
+          <w:cantSplit/>
+        </w:trPr>
+        <w:tc>
+          <w:tcPr>
+            <w:tcW w:type="dxa" w:w="1650"/>
+            <w:tcMar>
+              <w:top w:w="80" w:type="dxa"/>
+              <w:start w:w="120" w:type="dxa"/>
+              <w:bottom w:w="80" w:type="dxa"/>
+              <w:end w:w="120" w:type="dxa"/>
+            </w:tcMar>
+            <w:vAlign w:val="center"/>
+            <w:shd w:fill="FFFFFF"/>
+          </w:tcPr>
+          <w:p>
+            <w:pPr>
+              <w:spacing w:before="0" w:after="40" w:line="252" w:lineRule="auto"/>
+              <w:jc w:val="center"/>
+            </w:pPr>
+            <w:r>
+              <w:rPr>
+                <w:rFonts w:ascii="Calibri" w:hAnsi="Calibri"/>
+                <w:b w:val="0"/>
+                <w:color w:val="111827"/>
+                <w:sz w:val="17"/>
+              </w:rPr>
+              <w:t>DV-T-035</w:t>
+            </w:r>
+          </w:p>
+        </w:tc>
+        <w:tc>
+          <w:tcPr>
+            <w:tcW w:type="dxa" w:w="4450"/>
+            <w:tcMar>
+              <w:top w:w="80" w:type="dxa"/>
+              <w:start w:w="120" w:type="dxa"/>
+              <w:bottom w:w="80" w:type="dxa"/>
+              <w:end w:w="120" w:type="dxa"/>
+            </w:tcMar>
+            <w:vAlign w:val="center"/>
+            <w:shd w:fill="FFFFFF"/>
+          </w:tcPr>
+          <w:p>
+            <w:pPr>
+              <w:spacing w:before="0" w:after="40" w:line="252" w:lineRule="auto"/>
+              <w:jc w:val="left"/>
+            </w:pPr>
+            <w:r>
+              <w:rPr>
+                <w:rFonts w:ascii="Calibri" w:hAnsi="Calibri"/>
+                <w:b w:val="0"/>
+                <w:color w:val="111827"/>
+                <w:sz w:val="17"/>
+              </w:rPr>
+              <w:t>Inspect cabin-temperature and tyre-pressure mappings</w:t>
+            </w:r>
+          </w:p>
+        </w:tc>
+        <w:tc>
+          <w:tcPr>
+            <w:tcW w:type="dxa" w:w="3260"/>
+            <w:tcMar>
+              <w:top w:w="80" w:type="dxa"/>
+              <w:start w:w="120" w:type="dxa"/>
+              <w:bottom w:w="80" w:type="dxa"/>
+              <w:end w:w="120" w:type="dxa"/>
+            </w:tcMar>
+            <w:vAlign w:val="center"/>
+            <w:shd w:fill="FFFFFF"/>
+          </w:tcPr>
+          <w:p>
+            <w:pPr>
+              <w:spacing w:before="0" w:after="40" w:line="252" w:lineRule="auto"/>
+              <w:jc w:val="left"/>
+            </w:pPr>
+            <w:r>
+              <w:rPr>
+                <w:rFonts w:ascii="Calibri" w:hAnsi="Calibri"/>
+                <w:b w:val="0"/>
+                <w:color w:val="111827"/>
+                <w:sz w:val="17"/>
+              </w:rPr>
+              <w:t>Seat/wheel area IDs are required while global properties reject that assumption</w:t>
+            </w:r>
+          </w:p>
+        </w:tc>
+      </w:tr>
+      <w:tr>
+        <w:trPr>
+          <w:cantSplit/>
+        </w:trPr>
+        <w:tc>
+          <w:tcPr>
+            <w:tcW w:type="dxa" w:w="1650"/>
+            <w:tcMar>
+              <w:top w:w="80" w:type="dxa"/>
+              <w:start w:w="120" w:type="dxa"/>
+              <w:bottom w:w="80" w:type="dxa"/>
+              <w:end w:w="120" w:type="dxa"/>
+            </w:tcMar>
+            <w:vAlign w:val="center"/>
+            <w:shd w:fill="FFFFFF"/>
+          </w:tcPr>
+          <w:p>
+            <w:pPr>
+              <w:spacing w:before="0" w:after="40" w:line="252" w:lineRule="auto"/>
+              <w:jc w:val="center"/>
+            </w:pPr>
+            <w:r>
+              <w:rPr>
+                <w:rFonts w:ascii="Calibri" w:hAnsi="Calibri"/>
+                <w:b w:val="0"/>
+                <w:color w:val="111827"/>
+                <w:sz w:val="17"/>
+              </w:rPr>
+              <w:t>DV-T-036</w:t>
+            </w:r>
+          </w:p>
+        </w:tc>
+        <w:tc>
+          <w:tcPr>
+            <w:tcW w:type="dxa" w:w="4450"/>
+            <w:tcMar>
+              <w:top w:w="80" w:type="dxa"/>
+              <w:start w:w="120" w:type="dxa"/>
+              <w:bottom w:w="80" w:type="dxa"/>
+              <w:end w:w="120" w:type="dxa"/>
+            </w:tcMar>
+            <w:vAlign w:val="center"/>
+            <w:shd w:fill="FFFFFF"/>
+          </w:tcPr>
+          <w:p>
+            <w:pPr>
+              <w:spacing w:before="0" w:after="40" w:line="252" w:lineRule="auto"/>
+              <w:jc w:val="left"/>
+            </w:pPr>
+            <w:r>
+              <w:rPr>
+                <w:rFonts w:ascii="Calibri" w:hAnsi="Calibri"/>
+                <w:b w:val="0"/>
+                <w:color w:val="111827"/>
+                <w:sz w:val="17"/>
+              </w:rPr>
+              <w:t>Inspect OpenAPI and gateway headers</w:t>
+            </w:r>
+          </w:p>
+        </w:tc>
+        <w:tc>
+          <w:tcPr>
+            <w:tcW w:type="dxa" w:w="3260"/>
+            <w:tcMar>
+              <w:top w:w="80" w:type="dxa"/>
+              <w:start w:w="120" w:type="dxa"/>
+              <w:bottom w:w="80" w:type="dxa"/>
+              <w:end w:w="120" w:type="dxa"/>
+            </w:tcMar>
+            <w:vAlign w:val="center"/>
+            <w:shd w:fill="FFFFFF"/>
+          </w:tcPr>
+          <w:p>
+            <w:pPr>
+              <w:spacing w:before="0" w:after="40" w:line="252" w:lineRule="auto"/>
+              <w:jc w:val="left"/>
+            </w:pPr>
+            <w:r>
+              <w:rPr>
+                <w:rFonts w:ascii="Calibri" w:hAnsi="Calibri"/>
+                <w:b w:val="0"/>
+                <w:color w:val="111827"/>
+                <w:sz w:val="17"/>
+              </w:rPr>
+              <w:t>Mapping response and workload authentication headers are published</w:t>
             </w:r>
           </w:p>
         </w:tc>
@@ -11655,6 +12603,85 @@
                 <w:sz w:val="17"/>
               </w:rPr>
               <w:t>docs/digital-vehicle-state.md</w:t>
+            </w:r>
+          </w:p>
+        </w:tc>
+      </w:tr>
+      <w:tr>
+        <w:trPr>
+          <w:cantSplit/>
+        </w:trPr>
+        <w:tc>
+          <w:tcPr>
+            <w:tcW w:type="dxa" w:w="2700"/>
+            <w:tcMar>
+              <w:top w:w="80" w:type="dxa"/>
+              <w:start w:w="120" w:type="dxa"/>
+              <w:bottom w:w="80" w:type="dxa"/>
+              <w:end w:w="120" w:type="dxa"/>
+            </w:tcMar>
+            <w:vAlign w:val="center"/>
+            <w:shd w:fill="FFFFFF"/>
+          </w:tcPr>
+          <w:p>
+            <w:pPr>
+              <w:spacing w:before="0" w:after="40" w:line="252" w:lineRule="auto"/>
+              <w:jc w:val="left"/>
+            </w:pPr>
+            <w:r>
+              <w:rPr>
+                <w:rFonts w:ascii="Calibri" w:hAnsi="Calibri"/>
+                <w:b w:val="0"/>
+                <w:color w:val="111827"/>
+                <w:sz w:val="17"/>
+              </w:rPr>
+              <w:t>Android Automotive mapping contract</w:t>
+            </w:r>
+          </w:p>
+        </w:tc>
+        <w:tc>
+          <w:tcPr>
+            <w:tcW w:type="dxa" w:w="6660"/>
+            <w:tcMar>
+              <w:top w:w="80" w:type="dxa"/>
+              <w:start w:w="120" w:type="dxa"/>
+              <w:bottom w:w="80" w:type="dxa"/>
+              <w:end w:w="120" w:type="dxa"/>
+            </w:tcMar>
+            <w:vAlign w:val="center"/>
+            <w:shd w:fill="FFFFFF"/>
+          </w:tcPr>
+          <w:p>
+            <w:pPr>
+              <w:spacing w:before="0" w:after="40" w:line="252" w:lineRule="auto"/>
+              <w:jc w:val="left"/>
+            </w:pPr>
+            <w:r>
+              <w:rPr>
+                <w:rFonts w:ascii="Calibri" w:hAnsi="Calibri"/>
+                <w:b w:val="0"/>
+                <w:color w:val="111827"/>
+                <w:sz w:val="17"/>
+              </w:rPr>
+              <w:t>src/atep/vehicles/vhal_contracts.py</w:t>
+            </w:r>
+            <w:r>
+              <w:rPr>
+                <w:rFonts w:ascii="Calibri" w:hAnsi="Calibri"/>
+                <w:b w:val="0"/>
+                <w:color w:val="111827"/>
+                <w:sz w:val="17"/>
+              </w:rPr>
+              <w:t xml:space="preserve"> and </w:t>
+            </w:r>
+            <w:r>
+              <w:rPr>
+                <w:rFonts w:ascii="Calibri" w:hAnsi="Calibri"/>
+                <w:b w:val="0"/>
+                <w:color w:val="111827"/>
+                <w:sz w:val="17"/>
+              </w:rPr>
+              <w:t>src/atep/vehicles/gateway_router.py</w:t>
             </w:r>
           </w:p>
         </w:tc>
@@ -12160,7 +13187,7 @@
                 <w:color w:val="111827"/>
                 <w:sz w:val="17"/>
               </w:rPr>
-              <w:t>No VHAL property mapping</w:t>
+              <w:t>Symbolic mappings require Android-side SDK resolution</w:t>
             </w:r>
           </w:p>
         </w:tc>
@@ -12188,7 +13215,7 @@
                 <w:color w:val="111827"/>
                 <w:sz w:val="17"/>
               </w:rPr>
-              <w:t>CarSystemUI integration remains API/gateway-oriented</w:t>
+              <w:t>A mismatched CarSystemUI SDK may not expose every reviewed property</w:t>
             </w:r>
           </w:p>
         </w:tc>
@@ -12216,7 +13243,7 @@
                 <w:color w:val="111827"/>
                 <w:sz w:val="17"/>
               </w:rPr>
-              <w:t>Add contract mappings and end-to-end evidence in II-6</w:t>
+              <w:t>Validate availability explicitly and retain the existing no-silent-fallback behavior</w:t>
             </w:r>
           </w:p>
         </w:tc>
@@ -12877,7 +13904,7 @@
                 <w:color w:val="111827"/>
                 <w:sz w:val="17"/>
               </w:rPr>
-              <w:t>Planned next</w:t>
+              <w:t>Implemented</w:t>
             </w:r>
           </w:p>
         </w:tc>
@@ -12887,6 +13914,16 @@
       <w:pPr>
         <w:spacing w:after="60"/>
       </w:pPr>
+    </w:p>
+    <w:p>
+      <w:r>
+        <w:rPr>
+          <w:rFonts w:ascii="Calibri" w:hAnsi="Calibri"/>
+          <w:color w:val="111827"/>
+          <w:sz w:val="22"/>
+        </w:rPr>
+        <w:t>The recommended next increment begins Volume III with a bounded ECU aggregate and lifecycle before adding CAN or diagnostic protocol behavior.</w:t>
+      </w:r>
     </w:p>
     <w:p>
       <w:pPr>
@@ -13029,7 +14066,7 @@
         <w:color w:val="667085"/>
         <w:sz w:val="17"/>
       </w:rPr>
-      <w:t>ATEP Volume II Workbook  |  Version 0.5.0</w:t>
+      <w:t>ATEP Volume II Workbook  |  Version 0.6.0</w:t>
     </w:r>
     <w:r>
       <w:rPr>

</xml_diff>